<commit_message>
Replace old IMovies files with updated project
</commit_message>
<xml_diff>
--- a/docs/IMovies-Project-Report.docx
+++ b/docs/IMovies-Project-Report.docx
@@ -8,11 +8,6 @@
         <w:jc w:val="center"/>
       </w:pPr>
       <w:r>
-        <w:rPr>
-          <w:b/>
-          <w:color w:val="C94E67"/>
-          <w:sz w:val="34"/>
-        </w:rPr>
         <w:t>🎬  IMOVIES</w:t>
       </w:r>
     </w:p>
@@ -37,11 +32,7 @@
         <w:jc w:val="center"/>
       </w:pPr>
       <w:r>
-        <w:rPr>
-          <w:color w:val="7052B6"/>
-          <w:sz w:val="26"/>
-        </w:rPr>
-        <w:t>Full Stack Developer - MERN  |  Intermediate Project</w:t>
+        <w:t>Full Stack Developer - MERN  |  Intermediate Project  |  Version 2.0</w:t>
       </w:r>
     </w:p>
     <w:p/>
@@ -111,6 +102,10 @@
         <w:gridCol w:w="4997"/>
       </w:tblGrid>
       <w:tr>
+        <w:trPr>
+          <w:tblHeader w:val="true"/>
+          <w:cantSplit/>
+        </w:trPr>
         <w:tc>
           <w:tcPr>
             <w:tcW w:type="dxa" w:w="3024"/>
@@ -147,6 +142,9 @@
         </w:tc>
       </w:tr>
       <w:tr>
+        <w:trPr>
+          <w:cantSplit/>
+        </w:trPr>
         <w:tc>
           <w:tcPr>
             <w:tcW w:type="dxa" w:w="3024"/>
@@ -183,6 +181,9 @@
         </w:tc>
       </w:tr>
       <w:tr>
+        <w:trPr>
+          <w:cantSplit/>
+        </w:trPr>
         <w:tc>
           <w:tcPr>
             <w:tcW w:type="dxa" w:w="3024"/>
@@ -221,6 +222,9 @@
         </w:tc>
       </w:tr>
       <w:tr>
+        <w:trPr>
+          <w:cantSplit/>
+        </w:trPr>
         <w:tc>
           <w:tcPr>
             <w:tcW w:type="dxa" w:w="3024"/>
@@ -257,6 +261,9 @@
         </w:tc>
       </w:tr>
       <w:tr>
+        <w:trPr>
+          <w:cantSplit/>
+        </w:trPr>
         <w:tc>
           <w:tcPr>
             <w:tcW w:type="dxa" w:w="3024"/>
@@ -295,6 +302,9 @@
         </w:tc>
       </w:tr>
       <w:tr>
+        <w:trPr>
+          <w:cantSplit/>
+        </w:trPr>
         <w:tc>
           <w:tcPr>
             <w:tcW w:type="dxa" w:w="3024"/>
@@ -318,19 +328,16 @@
             <w:vAlign w:val="center"/>
           </w:tcPr>
           <w:p>
-            <w:pPr>
-              <w:spacing w:after="20" w:before="20"/>
-            </w:pPr>
-            <w:r>
-              <w:rPr>
-                <w:sz w:val="18"/>
-              </w:rPr>
-              <w:t>1.0 - Initial MVP documentation</w:t>
+            <w:r>
+              <w:t>2.0 - Expanded implementation source; hosted deployment and regression verification pending</w:t>
             </w:r>
           </w:p>
         </w:tc>
       </w:tr>
       <w:tr>
+        <w:trPr>
+          <w:cantSplit/>
+        </w:trPr>
         <w:tc>
           <w:tcPr>
             <w:tcW w:type="dxa" w:w="3024"/>
@@ -356,14 +363,8 @@
             <w:shd w:fill="F4F2F9"/>
           </w:tcPr>
           <w:p>
-            <w:pPr>
-              <w:spacing w:after="20" w:before="20"/>
-            </w:pPr>
-            <w:r>
-              <w:rPr>
-                <w:sz w:val="18"/>
-              </w:rPr>
-              <w:t>To be added after publishing the repository and recording the live demo</w:t>
+            <w:r>
+              <w:t>GitHub: https://github.com/AmayGuptaEN24CS3010116/IMovies | Live site: https://i-movies-amber.vercel.app/ | Demo video: add after recording</w:t>
             </w:r>
           </w:p>
         </w:tc>
@@ -389,10 +390,7 @@
     </w:p>
     <w:p>
       <w:r>
-        <w:rPr>
-          <w:i w:val="0"/>
-        </w:rPr>
-        <w:t>This report describes the current codebase and its intended behaviour. It follows the supplied template structure: project description and scenario, system requirements, architecture, project setup, backend, database, frontend, execution, output evidence, and final deliverables.</w:t>
+        <w:t>This report follows the supplied full-stack project template: project description and scenario, system requirements, architecture, project setup, backend and database implementation, frontend, execution, testing, limitations and final deliverables. It describes the expanded source package prepared for the next GitHub deployment.</w:t>
       </w:r>
     </w:p>
     <w:tbl>
@@ -407,6 +405,10 @@
         <w:gridCol w:w="4997"/>
       </w:tblGrid>
       <w:tr>
+        <w:trPr>
+          <w:tblHeader w:val="true"/>
+          <w:cantSplit/>
+        </w:trPr>
         <w:tc>
           <w:tcPr>
             <w:tcW w:type="dxa" w:w="1152"/>
@@ -443,6 +445,9 @@
         </w:tc>
       </w:tr>
       <w:tr>
+        <w:trPr>
+          <w:cantSplit/>
+        </w:trPr>
         <w:tc>
           <w:tcPr>
             <w:tcW w:type="dxa" w:w="1152"/>
@@ -479,6 +484,9 @@
         </w:tc>
       </w:tr>
       <w:tr>
+        <w:trPr>
+          <w:cantSplit/>
+        </w:trPr>
         <w:tc>
           <w:tcPr>
             <w:tcW w:type="dxa" w:w="1152"/>
@@ -517,6 +525,9 @@
         </w:tc>
       </w:tr>
       <w:tr>
+        <w:trPr>
+          <w:cantSplit/>
+        </w:trPr>
         <w:tc>
           <w:tcPr>
             <w:tcW w:type="dxa" w:w="1152"/>
@@ -540,19 +551,16 @@
             <w:vAlign w:val="center"/>
           </w:tcPr>
           <w:p>
-            <w:pPr>
-              <w:spacing w:after="20" w:before="20"/>
-            </w:pPr>
-            <w:r>
-              <w:rPr>
-                <w:sz w:val="17"/>
-              </w:rPr>
-              <w:t>Project architecture, ER model, user flow, features, roles and MVC/request handling</w:t>
+            <w:r>
+              <w:t>Project architecture, extended ER model, customer/admin user flow, features, roles, MVC/request handling, security and realtime updates</w:t>
             </w:r>
           </w:p>
         </w:tc>
       </w:tr>
       <w:tr>
+        <w:trPr>
+          <w:cantSplit/>
+        </w:trPr>
         <w:tc>
           <w:tcPr>
             <w:tcW w:type="dxa" w:w="1152"/>
@@ -591,6 +599,9 @@
         </w:tc>
       </w:tr>
       <w:tr>
+        <w:trPr>
+          <w:cantSplit/>
+        </w:trPr>
         <w:tc>
           <w:tcPr>
             <w:tcW w:type="dxa" w:w="1152"/>
@@ -627,6 +638,9 @@
         </w:tc>
       </w:tr>
       <w:tr>
+        <w:trPr>
+          <w:cantSplit/>
+        </w:trPr>
         <w:tc>
           <w:tcPr>
             <w:tcW w:type="dxa" w:w="1152"/>
@@ -652,19 +666,16 @@
             <w:shd w:fill="F4F2F9"/>
           </w:tcPr>
           <w:p>
-            <w:pPr>
-              <w:spacing w:after="20" w:before="20"/>
-            </w:pPr>
-            <w:r>
-              <w:rPr>
-                <w:sz w:val="17"/>
-              </w:rPr>
-              <w:t>Database design and seed data</w:t>
+            <w:r>
+              <w:t>Database design, sample dataset and eight collection models</w:t>
             </w:r>
           </w:p>
         </w:tc>
       </w:tr>
       <w:tr>
+        <w:trPr>
+          <w:cantSplit/>
+        </w:trPr>
         <w:tc>
           <w:tcPr>
             <w:tcW w:type="dxa" w:w="1152"/>
@@ -701,6 +712,9 @@
         </w:tc>
       </w:tr>
       <w:tr>
+        <w:trPr>
+          <w:cantSplit/>
+        </w:trPr>
         <w:tc>
           <w:tcPr>
             <w:tcW w:type="dxa" w:w="1152"/>
@@ -739,6 +753,9 @@
         </w:tc>
       </w:tr>
       <w:tr>
+        <w:trPr>
+          <w:cantSplit/>
+        </w:trPr>
         <w:tc>
           <w:tcPr>
             <w:tcW w:type="dxa" w:w="1152"/>
@@ -775,6 +792,9 @@
         </w:tc>
       </w:tr>
       <w:tr>
+        <w:trPr>
+          <w:cantSplit/>
+        </w:trPr>
         <w:tc>
           <w:tcPr>
             <w:tcW w:type="dxa" w:w="1152"/>
@@ -820,13 +840,7 @@
     </w:p>
     <w:p>
       <w:r>
-        <w:rPr>
-          <w:b/>
-        </w:rPr>
-        <w:t>Evidence status:</w:t>
-      </w:r>
-      <w:r>
-        <w:t xml:space="preserve"> the diagrams are architecture documentation and the UI images are illustrative previews. They are not proof of a live test. The app must be started on the submitter’s computer, tests must be recorded, and actual output screenshots/demo links added before final hand-in.</w:t>
+        <w:t>Evidence status: the updated source package has passed JavaScript syntax checks and five automated helper unit tests in this environment. The current hosted website must be updated from the expanded source and the full browser regression checklist must be re-run before recording the final demo. Images in assets/previews/ are illustrative UI previews; only files in assets/screenshots/ captured by the student should be described as live output evidence.</w:t>
       </w:r>
     </w:p>
     <w:p>
@@ -839,10 +853,7 @@
     </w:p>
     <w:p>
       <w:r>
-        <w:rPr>
-          <w:i w:val="0"/>
-        </w:rPr>
-        <w:t>IMovies - Movie Ticket Booking Made Simple is a full-stack web application that helps users discover movies and make a demo ticket booking through a single interface. The React frontend displays movie information, search and genre filters, show dates and times, a seat-selection layout, and a My Tickets view. The Express.js backend exposes REST API endpoints for movies, user registration/login, and booking operations. MongoDB stores user, movie, and booking documents, while Mongoose defines schemas and references between collections. Passwords are hashed using bcryptjs and protected requests use JSON Web Tokens (JWT). The current MVP does not process payments and should be used for learning and demonstration rather than real-world ticket sales.</w:t>
+        <w:t>IMovies - Movie Ticket Booking Made Simple is a MERN-stack cinema-booking and management student application. It provides a movie catalogue with title, genre, language and city filters; MongoDB-backed theatre schedules; seat selection with Socket.IO refresh events; JWT user authentication; booking history and cancellation; persistent notifications; a simulated-payment ledger; and a role-protected admin dashboard for movies, theatres, shows and booking oversight. Payment is simulated and no real funds are collected.</w:t>
       </w:r>
     </w:p>
     <w:p>
@@ -855,10 +866,7 @@
     </w:p>
     <w:p>
       <w:r>
-        <w:rPr>
-          <w:i w:val="0"/>
-        </w:rPr>
-        <w:t>Moviegoers often need to compare films, decide on a showtime, select seats and keep booking details accessible. IMovies demonstrates this flow in one responsive web application. A visitor can browse available sample movies, search or filter by genre, open a movie, select a date/time and seats, then sign in to submit the booking. The backend checks the selected seats against existing confirmed bookings for the same movie, date and showtime, stores the booking, and returns a confirmation code. The user can later view their saved bookings in My Tickets.</w:t>
+        <w:t>Moviegoers need to compare films, find a nearby cinema, choose a date and showtime, select available seats and keep their booking details accessible. IMovies demonstrates this process in one responsive application. Customers can browse/filter movies, open the available show schedule for a date and city, select a theatre and seats, confirm a demo booking and later review or cancel it. Administrators can maintain movies, theatres and schedules from a protected dashboard.</w:t>
       </w:r>
     </w:p>
     <w:p>
@@ -871,10 +879,7 @@
     </w:p>
     <w:p>
       <w:r>
-        <w:rPr>
-          <w:i w:val="0"/>
-        </w:rPr>
-        <w:t>The project provides a learning-focused example of how a modern web client communicates with a REST backend and persistent database to implement a multi-step booking workflow. It also demonstrates user authentication, data modeling, input validation, and the separation of UI and server-side responsibilities.</w:t>
+        <w:t>The project demonstrates client-server separation, database modeling, authentication, role-based authorization, data validation, inventory protection, real-time UI updates and a persistent booking workflow. Its payment path is an explicit simulation for academic demonstrations, not a connected payment gateway.</w:t>
       </w:r>
     </w:p>
     <w:p>
@@ -891,7 +896,7 @@
         <w:spacing w:after="40"/>
       </w:pPr>
       <w:r>
-        <w:t>Build a clean responsive movie catalogue with search and genre filters.</w:t>
+        <w:t>Build a responsive movie catalogue with search and genre, language and city filters.</w:t>
       </w:r>
     </w:p>
     <w:p>
@@ -900,7 +905,7 @@
         <w:spacing w:after="40"/>
       </w:pPr>
       <w:r>
-        <w:t>Implement user registration and login with password hashing and JWT authentication.</w:t>
+        <w:t>Implement registration/login using bcrypt password hashing and JWT-protected API routes.</w:t>
       </w:r>
     </w:p>
     <w:p>
@@ -909,7 +914,7 @@
         <w:spacing w:after="40"/>
       </w:pPr>
       <w:r>
-        <w:t>Represent movies, users and bookings with MongoDB/Mongoose models.</w:t>
+        <w:t>Model users, movies, theatres, shows, seat reservations, bookings, demo payments and notifications in MongoDB/Mongoose.</w:t>
       </w:r>
     </w:p>
     <w:p>
@@ -918,7 +923,7 @@
         <w:spacing w:after="40"/>
       </w:pPr>
       <w:r>
-        <w:t>Allow a signed-in user to choose a movie, show date/time and multiple seats.</w:t>
+        <w:t>Let users select real scheduled shows and see current seat availability, including Socket.IO refresh events.</w:t>
       </w:r>
     </w:p>
     <w:p>
@@ -927,7 +932,7 @@
         <w:spacing w:after="40"/>
       </w:pPr>
       <w:r>
-        <w:t>Check already-booked seats on the server before creating a new booking.</w:t>
+        <w:t>Prevent duplicate reservations with a unique show-seat index; support booking cancellation and seat release.</w:t>
       </w:r>
     </w:p>
     <w:p>
@@ -936,7 +941,7 @@
         <w:spacing w:after="40"/>
       </w:pPr>
       <w:r>
-        <w:t>Provide a My Tickets screen and clear local setup/test documentation.</w:t>
+        <w:t>Provide a role-protected admin panel, paginated APIs, rate limits, unit tests and setup/deployment documentation.</w:t>
       </w:r>
     </w:p>
     <w:p>
@@ -959,6 +964,10 @@
         <w:gridCol w:w="4997"/>
       </w:tblGrid>
       <w:tr>
+        <w:trPr>
+          <w:tblHeader w:val="true"/>
+          <w:cantSplit/>
+        </w:trPr>
         <w:tc>
           <w:tcPr>
             <w:tcW w:type="dxa" w:w="4536"/>
@@ -970,9 +979,8 @@
               <w:rPr>
                 <w:b/>
                 <w:color w:val="FFFFFF"/>
-                <w:sz w:val="16"/>
               </w:rPr>
-              <w:t>Included in the MVP</w:t>
+              <w:t>Included in the expanded source</w:t>
             </w:r>
           </w:p>
         </w:tc>
@@ -987,28 +995,24 @@
               <w:rPr>
                 <w:b/>
                 <w:color w:val="FFFFFF"/>
-                <w:sz w:val="16"/>
               </w:rPr>
-              <w:t>Not included in this version</w:t>
+              <w:t>Not included / production limitation</w:t>
             </w:r>
           </w:p>
         </w:tc>
       </w:tr>
       <w:tr>
+        <w:trPr>
+          <w:cantSplit/>
+        </w:trPr>
         <w:tc>
           <w:tcPr>
             <w:tcW w:type="dxa" w:w="4536"/>
             <w:vAlign w:val="center"/>
           </w:tcPr>
           <w:p>
-            <w:pPr>
-              <w:spacing w:after="20" w:before="20"/>
-            </w:pPr>
-            <w:r>
-              <w:rPr>
-                <w:sz w:val="16"/>
-              </w:rPr>
-              <w:t>Movie catalogue with sample records</w:t>
+            <w:r>
+              <w:t>Movie catalogue with title, genre, language and city filters</w:t>
             </w:r>
           </w:p>
         </w:tc>
@@ -1018,19 +1022,16 @@
             <w:vAlign w:val="center"/>
           </w:tcPr>
           <w:p>
-            <w:pPr>
-              <w:spacing w:after="20" w:before="20"/>
-            </w:pPr>
-            <w:r>
-              <w:rPr>
-                <w:sz w:val="16"/>
-              </w:rPr>
-              <w:t>Real payment gateway or refunds</w:t>
+            <w:r>
+              <w:t>Real payment provider or real refunds; demo-only payment records</w:t>
             </w:r>
           </w:p>
         </w:tc>
       </w:tr>
       <w:tr>
+        <w:trPr>
+          <w:cantSplit/>
+        </w:trPr>
         <w:tc>
           <w:tcPr>
             <w:tcW w:type="dxa" w:w="4536"/>
@@ -1038,14 +1039,8 @@
             <w:shd w:fill="F4F2F9"/>
           </w:tcPr>
           <w:p>
-            <w:pPr>
-              <w:spacing w:after="20" w:before="20"/>
-            </w:pPr>
-            <w:r>
-              <w:rPr>
-                <w:sz w:val="16"/>
-              </w:rPr>
-              <w:t>Register/login and protected routes</w:t>
+            <w:r>
+              <w:t>Registration/login, bcrypt, JWT and admin role checks</w:t>
             </w:r>
           </w:p>
         </w:tc>
@@ -1056,33 +1051,24 @@
             <w:shd w:fill="F4F2F9"/>
           </w:tcPr>
           <w:p>
-            <w:pPr>
-              <w:spacing w:after="20" w:before="20"/>
-            </w:pPr>
-            <w:r>
-              <w:rPr>
-                <w:sz w:val="16"/>
-              </w:rPr>
-              <w:t>Admin dashboard and movie CRUD interface</w:t>
+            <w:r>
+              <w:t>Email/SMS tickets and QR/PDF download</w:t>
             </w:r>
           </w:p>
         </w:tc>
       </w:tr>
       <w:tr>
+        <w:trPr>
+          <w:cantSplit/>
+        </w:trPr>
         <w:tc>
           <w:tcPr>
             <w:tcW w:type="dxa" w:w="4536"/>
             <w:vAlign w:val="center"/>
           </w:tcPr>
           <w:p>
-            <w:pPr>
-              <w:spacing w:after="20" w:before="20"/>
-            </w:pPr>
-            <w:r>
-              <w:rPr>
-                <w:sz w:val="16"/>
-              </w:rPr>
-              <w:t>Seat selection and demo booking confirmation</w:t>
+            <w:r>
+              <w:t>MongoDB-backed theatres/shows; show-specific seats and Socket.IO refresh</w:t>
             </w:r>
           </w:p>
         </w:tc>
@@ -1092,19 +1078,16 @@
             <w:vAlign w:val="center"/>
           </w:tcPr>
           <w:p>
-            <w:pPr>
-              <w:spacing w:after="20" w:before="20"/>
-            </w:pPr>
-            <w:r>
-              <w:rPr>
-                <w:sz w:val="16"/>
-              </w:rPr>
-              <w:t>Atomic reservation/locking for concurrent booking attempts</w:t>
+            <w:r>
+              <w:t>Full multi-document transaction/reconciliation and expiring seat-hold cleanup</w:t>
             </w:r>
           </w:p>
         </w:tc>
       </w:tr>
       <w:tr>
+        <w:trPr>
+          <w:cantSplit/>
+        </w:trPr>
         <w:tc>
           <w:tcPr>
             <w:tcW w:type="dxa" w:w="4536"/>
@@ -1112,14 +1095,8 @@
             <w:shd w:fill="F4F2F9"/>
           </w:tcPr>
           <w:p>
-            <w:pPr>
-              <w:spacing w:after="20" w:before="20"/>
-            </w:pPr>
-            <w:r>
-              <w:rPr>
-                <w:sz w:val="16"/>
-              </w:rPr>
-              <w:t>My Tickets history</w:t>
+            <w:r>
+              <w:t>Booking history, cancellation, seat release and persistent notifications</w:t>
             </w:r>
           </w:p>
         </w:tc>
@@ -1130,33 +1107,24 @@
             <w:shd w:fill="F4F2F9"/>
           </w:tcPr>
           <w:p>
-            <w:pPr>
-              <w:spacing w:after="20" w:before="20"/>
-            </w:pPr>
-            <w:r>
-              <w:rPr>
-                <w:sz w:val="16"/>
-              </w:rPr>
-              <w:t>Real cinema inventory integrations or email/SMS delivery</w:t>
+            <w:r>
+              <w:t>Production-grade admin audit, MFA and privileged account provisioning</w:t>
             </w:r>
           </w:p>
         </w:tc>
       </w:tr>
       <w:tr>
+        <w:trPr>
+          <w:cantSplit/>
+        </w:trPr>
         <w:tc>
           <w:tcPr>
             <w:tcW w:type="dxa" w:w="4536"/>
             <w:vAlign w:val="center"/>
           </w:tcPr>
           <w:p>
-            <w:pPr>
-              <w:spacing w:after="20" w:before="20"/>
-            </w:pPr>
-            <w:r>
-              <w:rPr>
-                <w:sz w:val="16"/>
-              </w:rPr>
-              <w:t>Local development setup with MongoDB</w:t>
+            <w:r>
+              <w:t>Admin CRUD for movies, theatres and shows; booking overview; pagination and rate limits</w:t>
             </w:r>
           </w:p>
         </w:tc>
@@ -1166,14 +1134,8 @@
             <w:vAlign w:val="center"/>
           </w:tcPr>
           <w:p>
-            <w:pPr>
-              <w:spacing w:after="20" w:before="20"/>
-            </w:pPr>
-            <w:r>
-              <w:rPr>
-                <w:sz w:val="16"/>
-              </w:rPr>
-              <w:t>Production hosting, monitoring and hardened security</w:t>
+            <w:r>
+              <w:t>Distributed rate limiting, monitoring, load testing and full e2e suite</w:t>
             </w:r>
           </w:p>
         </w:tc>
@@ -1212,6 +1174,10 @@
         <w:gridCol w:w="4997"/>
       </w:tblGrid>
       <w:tr>
+        <w:trPr>
+          <w:tblHeader w:val="true"/>
+          <w:cantSplit/>
+        </w:trPr>
         <w:tc>
           <w:tcPr>
             <w:tcW w:type="dxa" w:w="3528"/>
@@ -1248,6 +1214,9 @@
         </w:tc>
       </w:tr>
       <w:tr>
+        <w:trPr>
+          <w:cantSplit/>
+        </w:trPr>
         <w:tc>
           <w:tcPr>
             <w:tcW w:type="dxa" w:w="3528"/>
@@ -1284,6 +1253,9 @@
         </w:tc>
       </w:tr>
       <w:tr>
+        <w:trPr>
+          <w:cantSplit/>
+        </w:trPr>
         <w:tc>
           <w:tcPr>
             <w:tcW w:type="dxa" w:w="3528"/>
@@ -1322,6 +1294,9 @@
         </w:tc>
       </w:tr>
       <w:tr>
+        <w:trPr>
+          <w:cantSplit/>
+        </w:trPr>
         <w:tc>
           <w:tcPr>
             <w:tcW w:type="dxa" w:w="3528"/>
@@ -1358,6 +1333,9 @@
         </w:tc>
       </w:tr>
       <w:tr>
+        <w:trPr>
+          <w:cantSplit/>
+        </w:trPr>
         <w:tc>
           <w:tcPr>
             <w:tcW w:type="dxa" w:w="3528"/>
@@ -1396,6 +1374,9 @@
         </w:tc>
       </w:tr>
       <w:tr>
+        <w:trPr>
+          <w:cantSplit/>
+        </w:trPr>
         <w:tc>
           <w:tcPr>
             <w:tcW w:type="dxa" w:w="3528"/>
@@ -1432,6 +1413,9 @@
         </w:tc>
       </w:tr>
       <w:tr>
+        <w:trPr>
+          <w:cantSplit/>
+        </w:trPr>
         <w:tc>
           <w:tcPr>
             <w:tcW w:type="dxa" w:w="3528"/>
@@ -1470,6 +1454,9 @@
         </w:tc>
       </w:tr>
       <w:tr>
+        <w:trPr>
+          <w:cantSplit/>
+        </w:trPr>
         <w:tc>
           <w:tcPr>
             <w:tcW w:type="dxa" w:w="3528"/>
@@ -1506,6 +1493,9 @@
         </w:tc>
       </w:tr>
       <w:tr>
+        <w:trPr>
+          <w:cantSplit/>
+        </w:trPr>
         <w:tc>
           <w:tcPr>
             <w:tcW w:type="dxa" w:w="3528"/>
@@ -1544,6 +1534,9 @@
         </w:tc>
       </w:tr>
       <w:tr>
+        <w:trPr>
+          <w:cantSplit/>
+        </w:trPr>
         <w:tc>
           <w:tcPr>
             <w:tcW w:type="dxa" w:w="3528"/>
@@ -1580,6 +1573,9 @@
         </w:tc>
       </w:tr>
       <w:tr>
+        <w:trPr>
+          <w:cantSplit/>
+        </w:trPr>
         <w:tc>
           <w:tcPr>
             <w:tcW w:type="dxa" w:w="3528"/>
@@ -1644,6 +1640,10 @@
         <w:gridCol w:w="3331"/>
       </w:tblGrid>
       <w:tr>
+        <w:trPr>
+          <w:tblHeader w:val="true"/>
+          <w:cantSplit/>
+        </w:trPr>
         <w:tc>
           <w:tcPr>
             <w:tcW w:type="dxa" w:w="1872"/>
@@ -1697,6 +1697,9 @@
         </w:tc>
       </w:tr>
       <w:tr>
+        <w:trPr>
+          <w:cantSplit/>
+        </w:trPr>
         <w:tc>
           <w:tcPr>
             <w:tcW w:type="dxa" w:w="1872"/>
@@ -1750,6 +1753,9 @@
         </w:tc>
       </w:tr>
       <w:tr>
+        <w:trPr>
+          <w:cantSplit/>
+        </w:trPr>
         <w:tc>
           <w:tcPr>
             <w:tcW w:type="dxa" w:w="1872"/>
@@ -1806,6 +1812,9 @@
         </w:tc>
       </w:tr>
       <w:tr>
+        <w:trPr>
+          <w:cantSplit/>
+        </w:trPr>
         <w:tc>
           <w:tcPr>
             <w:tcW w:type="dxa" w:w="1872"/>
@@ -1859,6 +1868,9 @@
         </w:tc>
       </w:tr>
       <w:tr>
+        <w:trPr>
+          <w:cantSplit/>
+        </w:trPr>
         <w:tc>
           <w:tcPr>
             <w:tcW w:type="dxa" w:w="1872"/>
@@ -1915,6 +1927,9 @@
         </w:tc>
       </w:tr>
       <w:tr>
+        <w:trPr>
+          <w:cantSplit/>
+        </w:trPr>
         <w:tc>
           <w:tcPr>
             <w:tcW w:type="dxa" w:w="1872"/>
@@ -1983,10 +1998,7 @@
     </w:p>
     <w:p>
       <w:r>
-        <w:rPr>
-          <w:i w:val="0"/>
-        </w:rPr>
-        <w:t>The application uses a client-server architecture. The React/Vite client sends HTTP requests to an Express API. Public movie routes return movie data; registration and login routes create or validate accounts; booking routes require a JWT and read/write booking data through Mongoose models. MongoDB stores the persistent documents.</w:t>
+        <w:t>The solution uses a React/Vite client, an Express REST API, a Socket.IO real-time channel, JWT/role middleware, and MongoDB via Mongoose. Public routes provide movies, active theatres, shows and seat availability. Authentication routes create/validate accounts. Protected booking, cancellation, payment-history and notification routes operate on the signed-in user. Admin routes are restricted to accounts whose stored role is `admin`. A unique seat-reservation index guards against duplicate show/seat claims.</w:t>
       </w:r>
     </w:p>
     <w:p>
@@ -2035,12 +2047,7 @@
         <w:jc w:val="center"/>
       </w:pPr>
       <w:r>
-        <w:rPr>
-          <w:i/>
-          <w:color w:val="6E6F80"/>
-          <w:sz w:val="16"/>
-        </w:rPr>
-        <w:t>Figure 1. Technical architecture of the IMovies MVP.</w:t>
+        <w:t>Figure 1. Technical architecture of the expanded IMovies application.</w:t>
       </w:r>
     </w:p>
     <w:p>
@@ -2063,6 +2070,10 @@
         <w:gridCol w:w="4997"/>
       </w:tblGrid>
       <w:tr>
+        <w:trPr>
+          <w:tblHeader w:val="true"/>
+          <w:cantSplit/>
+        </w:trPr>
         <w:tc>
           <w:tcPr>
             <w:tcW w:type="dxa" w:w="2376"/>
@@ -2074,7 +2085,6 @@
               <w:rPr>
                 <w:b/>
                 <w:color w:val="FFFFFF"/>
-                <w:sz w:val="16"/>
               </w:rPr>
               <w:t>Component</w:t>
             </w:r>
@@ -2091,7 +2101,6 @@
               <w:rPr>
                 <w:b/>
                 <w:color w:val="FFFFFF"/>
-                <w:sz w:val="16"/>
               </w:rPr>
               <w:t>Responsibilities</w:t>
             </w:r>
@@ -2099,19 +2108,16 @@
         </w:tc>
       </w:tr>
       <w:tr>
+        <w:trPr>
+          <w:cantSplit/>
+        </w:trPr>
         <w:tc>
           <w:tcPr>
             <w:tcW w:type="dxa" w:w="2376"/>
             <w:vAlign w:val="center"/>
           </w:tcPr>
           <w:p>
-            <w:pPr>
-              <w:spacing w:after="20" w:before="20"/>
-            </w:pPr>
-            <w:r>
-              <w:rPr>
-                <w:sz w:val="16"/>
-              </w:rPr>
+            <w:r>
               <w:t>React + Vite client</w:t>
             </w:r>
           </w:p>
@@ -2122,19 +2128,16 @@
             <w:vAlign w:val="center"/>
           </w:tcPr>
           <w:p>
-            <w:pPr>
-              <w:spacing w:after="20" w:before="20"/>
-            </w:pPr>
-            <w:r>
-              <w:rPr>
-                <w:sz w:val="16"/>
-              </w:rPr>
-              <w:t>Renders pages/components, movie cards, search/filter controls, authentication forms, seat selection and My Tickets; calls the REST API using fetch.</w:t>
+            <w:r>
+              <w:t>Renders movie catalogue, title/genre/language/city filters, show selector, realtime seat map, authentication, My Tickets, notifications and AdminPanel.</w:t>
             </w:r>
           </w:p>
         </w:tc>
       </w:tr>
       <w:tr>
+        <w:trPr>
+          <w:cantSplit/>
+        </w:trPr>
         <w:tc>
           <w:tcPr>
             <w:tcW w:type="dxa" w:w="2376"/>
@@ -2142,14 +2145,8 @@
             <w:shd w:fill="F4F2F9"/>
           </w:tcPr>
           <w:p>
-            <w:pPr>
-              <w:spacing w:after="20" w:before="20"/>
-            </w:pPr>
-            <w:r>
-              <w:rPr>
-                <w:sz w:val="16"/>
-              </w:rPr>
-              <w:t>Express API</w:t>
+            <w:r>
+              <w:t>Express + Socket.IO API</w:t>
             </w:r>
           </w:p>
         </w:tc>
@@ -2160,33 +2157,24 @@
             <w:shd w:fill="F4F2F9"/>
           </w:tcPr>
           <w:p>
-            <w:pPr>
-              <w:spacing w:after="20" w:before="20"/>
-            </w:pPr>
-            <w:r>
-              <w:rPr>
-                <w:sz w:val="16"/>
-              </w:rPr>
-              <w:t>Exposes `/api/health`, `/api/movies`, `/api/auth` and `/api/bookings` endpoints; parses JSON; applies CORS; returns JSON responses.</w:t>
+            <w:r>
+              <w:t>REST endpoints for authentication, movies, theatres, shows, bookings, payments, notifications and administration; emits show-seat change events.</w:t>
             </w:r>
           </w:p>
         </w:tc>
       </w:tr>
       <w:tr>
+        <w:trPr>
+          <w:cantSplit/>
+        </w:trPr>
         <w:tc>
           <w:tcPr>
             <w:tcW w:type="dxa" w:w="2376"/>
             <w:vAlign w:val="center"/>
           </w:tcPr>
           <w:p>
-            <w:pPr>
-              <w:spacing w:after="20" w:before="20"/>
-            </w:pPr>
-            <w:r>
-              <w:rPr>
-                <w:sz w:val="16"/>
-              </w:rPr>
-              <w:t>Authentication middleware</w:t>
+            <w:r>
+              <w:t>Authentication / authorization middleware</w:t>
             </w:r>
           </w:p>
         </w:tc>
@@ -2196,19 +2184,16 @@
             <w:vAlign w:val="center"/>
           </w:tcPr>
           <w:p>
-            <w:pPr>
-              <w:spacing w:after="20" w:before="20"/>
-            </w:pPr>
-            <w:r>
-              <w:rPr>
-                <w:sz w:val="16"/>
-              </w:rPr>
-              <w:t>Reads the Bearer token, verifies JWT and attaches the signed-in user to protected requests.</w:t>
+            <w:r>
+              <w:t>Verifies JWT, attaches current user and blocks admin routes unless stored role is `admin`.</w:t>
             </w:r>
           </w:p>
         </w:tc>
       </w:tr>
       <w:tr>
+        <w:trPr>
+          <w:cantSplit/>
+        </w:trPr>
         <w:tc>
           <w:tcPr>
             <w:tcW w:type="dxa" w:w="2376"/>
@@ -2216,14 +2201,8 @@
             <w:shd w:fill="F4F2F9"/>
           </w:tcPr>
           <w:p>
-            <w:pPr>
-              <w:spacing w:after="20" w:before="20"/>
-            </w:pPr>
-            <w:r>
-              <w:rPr>
-                <w:sz w:val="16"/>
-              </w:rPr>
-              <w:t>Mongoose models</w:t>
+            <w:r>
+              <w:t>Rate limits and validation</w:t>
             </w:r>
           </w:p>
         </w:tc>
@@ -2234,33 +2213,24 @@
             <w:shd w:fill="F4F2F9"/>
           </w:tcPr>
           <w:p>
-            <w:pPr>
-              <w:spacing w:after="20" w:before="20"/>
-            </w:pPr>
-            <w:r>
-              <w:rPr>
-                <w:sz w:val="16"/>
-              </w:rPr>
-              <w:t>Define User, Movie and Booking fields, validation rules, references and timestamps.</w:t>
+            <w:r>
+              <w:t>Limits API/auth/booking traffic; validates IDs, input fields, seat counts and access; centralized error handler standardizes responses.</w:t>
             </w:r>
           </w:p>
         </w:tc>
       </w:tr>
       <w:tr>
+        <w:trPr>
+          <w:cantSplit/>
+        </w:trPr>
         <w:tc>
           <w:tcPr>
             <w:tcW w:type="dxa" w:w="2376"/>
             <w:vAlign w:val="center"/>
           </w:tcPr>
           <w:p>
-            <w:pPr>
-              <w:spacing w:after="20" w:before="20"/>
-            </w:pPr>
-            <w:r>
-              <w:rPr>
-                <w:sz w:val="16"/>
-              </w:rPr>
-              <w:t>MongoDB</w:t>
+            <w:r>
+              <w:t>Mongoose models and indexes</w:t>
             </w:r>
           </w:p>
         </w:tc>
@@ -2270,14 +2240,33 @@
             <w:vAlign w:val="center"/>
           </w:tcPr>
           <w:p>
-            <w:pPr>
-              <w:spacing w:after="20" w:before="20"/>
-            </w:pPr>
-            <w:r>
-              <w:rPr>
-                <w:sz w:val="16"/>
-              </w:rPr>
-              <w:t>Persists account, movie and booking documents between sessions.</w:t>
+            <w:r>
+              <w:t>Define eight collection schemas, references, field rules, common-query indexes and unique show-seat reservations.</w:t>
+            </w:r>
+          </w:p>
+        </w:tc>
+      </w:tr>
+      <w:tr>
+        <w:trPr>
+          <w:cantSplit/>
+        </w:trPr>
+        <w:tc>
+          <w:tcPr>
+            <w:tcW w:type="dxa" w:w="4997"/>
+          </w:tcPr>
+          <w:p>
+            <w:r>
+              <w:t>MongoDB</w:t>
+            </w:r>
+          </w:p>
+        </w:tc>
+        <w:tc>
+          <w:tcPr>
+            <w:tcW w:type="dxa" w:w="4997"/>
+          </w:tcPr>
+          <w:p>
+            <w:r>
+              <w:t>Persists users, catalogue, theatres, schedules, seat reservation records, bookings, simulated payments and notifications.</w:t>
             </w:r>
           </w:p>
         </w:tc>
@@ -2298,10 +2287,7 @@
     </w:p>
     <w:p>
       <w:r>
-        <w:rPr>
-          <w:i w:val="0"/>
-        </w:rPr>
-        <w:t>MongoDB is a document database, so the model is implemented as collections with ObjectId references rather than fixed relational tables. A user can have multiple bookings, and a movie can be associated with multiple bookings. Each booking references one user and one movie.</w:t>
+        <w:t>MongoDB stores the design as collections with ObjectId references. A user can own many bookings and notifications; a movie belongs to many shows and bookings; each show references one movie and theatre; a booking references a user and movie plus a show when booked through the scheduled-show flow. SeatReservation records protect a unique seat within a show. Payment entries are demo-only, and Notification records persist booking/cancellation updates.</w:t>
       </w:r>
     </w:p>
     <w:p>
@@ -2312,7 +2298,7 @@
       <w:r>
         <w:drawing>
           <wp:inline xmlns:a="http://schemas.openxmlformats.org/drawingml/2006/main" xmlns:pic="http://schemas.openxmlformats.org/drawingml/2006/picture">
-            <wp:extent cx="5852160" cy="5566585"/>
+            <wp:extent cx="5852160" cy="5411243"/>
             <wp:docPr id="3" name="Picture 3"/>
             <wp:cNvGraphicFramePr>
               <a:graphicFrameLocks noChangeAspect="1"/>
@@ -2333,7 +2319,7 @@
                   <pic:spPr>
                     <a:xfrm>
                       <a:off x="0" y="0"/>
-                      <a:ext cx="5852160" cy="5566585"/>
+                      <a:ext cx="5852160" cy="5411243"/>
                     </a:xfrm>
                     <a:prstGeom prst="rect"/>
                   </pic:spPr>
@@ -2350,12 +2336,7 @@
         <w:jc w:val="center"/>
       </w:pPr>
       <w:r>
-        <w:rPr>
-          <w:i/>
-          <w:color w:val="6E6F80"/>
-          <w:sz w:val="16"/>
-        </w:rPr>
-        <w:t>Figure 2. Collection relationships. PK = document identifier; references connect booking documents to users and movies.</w:t>
+        <w:t>Figure 2. Expanded collection relationships: User, Movie, Theatre, Show, Booking, SeatReservation, Payment and Notification.</w:t>
       </w:r>
     </w:p>
     <w:p>
@@ -2379,6 +2360,10 @@
         <w:gridCol w:w="3331"/>
       </w:tblGrid>
       <w:tr>
+        <w:trPr>
+          <w:tblHeader w:val="true"/>
+          <w:cantSplit/>
+        </w:trPr>
         <w:tc>
           <w:tcPr>
             <w:tcW w:type="dxa" w:w="1584"/>
@@ -2390,7 +2375,6 @@
               <w:rPr>
                 <w:b/>
                 <w:color w:val="FFFFFF"/>
-                <w:sz w:val="15"/>
               </w:rPr>
               <w:t>Collection</w:t>
             </w:r>
@@ -2407,7 +2391,6 @@
               <w:rPr>
                 <w:b/>
                 <w:color w:val="FFFFFF"/>
-                <w:sz w:val="15"/>
               </w:rPr>
               <w:t>Important fields</w:t>
             </w:r>
@@ -2424,7 +2407,6 @@
               <w:rPr>
                 <w:b/>
                 <w:color w:val="FFFFFF"/>
-                <w:sz w:val="15"/>
               </w:rPr>
               <w:t>Relationship / constraints</w:t>
             </w:r>
@@ -2432,19 +2414,16 @@
         </w:tc>
       </w:tr>
       <w:tr>
+        <w:trPr>
+          <w:cantSplit/>
+        </w:trPr>
         <w:tc>
           <w:tcPr>
             <w:tcW w:type="dxa" w:w="1584"/>
             <w:vAlign w:val="center"/>
           </w:tcPr>
           <w:p>
-            <w:pPr>
-              <w:spacing w:after="20" w:before="20"/>
-            </w:pPr>
-            <w:r>
-              <w:rPr>
-                <w:sz w:val="15"/>
-              </w:rPr>
+            <w:r>
               <w:t>User</w:t>
             </w:r>
           </w:p>
@@ -2455,14 +2434,8 @@
             <w:vAlign w:val="center"/>
           </w:tcPr>
           <w:p>
-            <w:pPr>
-              <w:spacing w:after="20" w:before="20"/>
-            </w:pPr>
-            <w:r>
-              <w:rPr>
-                <w:sz w:val="15"/>
-              </w:rPr>
-              <w:t>name, email, passwordHash, role, timestamps</w:t>
+            <w:r>
+              <w:t>name, email, passwordHash, role</w:t>
             </w:r>
           </w:p>
         </w:tc>
@@ -2472,19 +2445,16 @@
             <w:vAlign w:val="center"/>
           </w:tcPr>
           <w:p>
-            <w:pPr>
-              <w:spacing w:after="20" w:before="20"/>
-            </w:pPr>
-            <w:r>
-              <w:rPr>
-                <w:sz w:val="15"/>
-              </w:rPr>
-              <w:t>Email is unique; passwordHash contains the hash rather than the raw password.</w:t>
+            <w:r>
+              <w:t>Unique email; password hash only; role user/admin.</w:t>
             </w:r>
           </w:p>
         </w:tc>
       </w:tr>
       <w:tr>
+        <w:trPr>
+          <w:cantSplit/>
+        </w:trPr>
         <w:tc>
           <w:tcPr>
             <w:tcW w:type="dxa" w:w="1584"/>
@@ -2492,13 +2462,7 @@
             <w:shd w:fill="F4F2F9"/>
           </w:tcPr>
           <w:p>
-            <w:pPr>
-              <w:spacing w:after="20" w:before="20"/>
-            </w:pPr>
-            <w:r>
-              <w:rPr>
-                <w:sz w:val="15"/>
-              </w:rPr>
+            <w:r>
               <w:t>Movie</w:t>
             </w:r>
           </w:p>
@@ -2510,13 +2474,7 @@
             <w:shd w:fill="F4F2F9"/>
           </w:tcPr>
           <w:p>
-            <w:pPr>
-              <w:spacing w:after="20" w:before="20"/>
-            </w:pPr>
-            <w:r>
-              <w:rPr>
-                <w:sz w:val="15"/>
-              </w:rPr>
+            <w:r>
               <w:t>title, description, genre[], duration, rating, language, certificate, posterUrl, price</w:t>
             </w:r>
           </w:p>
@@ -2528,33 +2486,24 @@
             <w:shd w:fill="F4F2F9"/>
           </w:tcPr>
           <w:p>
-            <w:pPr>
-              <w:spacing w:after="20" w:before="20"/>
-            </w:pPr>
-            <w:r>
-              <w:rPr>
-                <w:sz w:val="15"/>
-              </w:rPr>
-              <w:t>Movie catalogue record; price is used to calculate the demo booking total.</w:t>
+            <w:r>
+              <w:t>Catalogue record; price is default ticket price.</w:t>
             </w:r>
           </w:p>
         </w:tc>
       </w:tr>
       <w:tr>
+        <w:trPr>
+          <w:cantSplit/>
+        </w:trPr>
         <w:tc>
           <w:tcPr>
             <w:tcW w:type="dxa" w:w="1584"/>
             <w:vAlign w:val="center"/>
           </w:tcPr>
           <w:p>
-            <w:pPr>
-              <w:spacing w:after="20" w:before="20"/>
-            </w:pPr>
-            <w:r>
-              <w:rPr>
-                <w:sz w:val="15"/>
-              </w:rPr>
-              <w:t>Booking</w:t>
+            <w:r>
+              <w:t>Theatre</w:t>
             </w:r>
           </w:p>
         </w:tc>
@@ -2564,14 +2513,8 @@
             <w:vAlign w:val="center"/>
           </w:tcPr>
           <w:p>
-            <w:pPr>
-              <w:spacing w:after="20" w:before="20"/>
-            </w:pPr>
-            <w:r>
-              <w:rPr>
-                <w:sz w:val="15"/>
-              </w:rPr>
-              <w:t>user, movie, showDate, showTime, seats[], totalAmount, status, bookingCode, timestamps</w:t>
+            <w:r>
+              <w:t>name, city, address, screens, facilities, active</w:t>
             </w:r>
           </w:p>
         </w:tc>
@@ -2581,14 +2524,183 @@
             <w:vAlign w:val="center"/>
           </w:tcPr>
           <w:p>
-            <w:pPr>
-              <w:spacing w:after="20" w:before="20"/>
-            </w:pPr>
-            <w:r>
-              <w:rPr>
-                <w:sz w:val="15"/>
-              </w:rPr>
-              <w:t>References User and Movie; unique bookingCode; status is confirmed or cancelled.</w:t>
+            <w:r>
+              <w:t>Active flag excludes a deactivated theatre from public choices.</w:t>
+            </w:r>
+          </w:p>
+        </w:tc>
+      </w:tr>
+      <w:tr>
+        <w:trPr>
+          <w:cantSplit/>
+        </w:trPr>
+        <w:tc>
+          <w:tcPr>
+            <w:tcW w:type="dxa" w:w="3331"/>
+          </w:tcPr>
+          <w:p>
+            <w:r>
+              <w:t>Show</w:t>
+            </w:r>
+          </w:p>
+        </w:tc>
+        <w:tc>
+          <w:tcPr>
+            <w:tcW w:type="dxa" w:w="3331"/>
+          </w:tcPr>
+          <w:p>
+            <w:r>
+              <w:t>movie, theatre, showDate, showTime, screenName, language, price, seatRows, seatsPerRow, status</w:t>
+            </w:r>
+          </w:p>
+        </w:tc>
+        <w:tc>
+          <w:tcPr>
+            <w:tcW w:type="dxa" w:w="3331"/>
+          </w:tcPr>
+          <w:p>
+            <w:r>
+              <w:t>References Movie and Theatre; query indexes for schedule filtering.</w:t>
+            </w:r>
+          </w:p>
+        </w:tc>
+      </w:tr>
+      <w:tr>
+        <w:trPr>
+          <w:cantSplit/>
+        </w:trPr>
+        <w:tc>
+          <w:tcPr>
+            <w:tcW w:type="dxa" w:w="3331"/>
+          </w:tcPr>
+          <w:p>
+            <w:r>
+              <w:t>SeatReservation</w:t>
+            </w:r>
+          </w:p>
+        </w:tc>
+        <w:tc>
+          <w:tcPr>
+            <w:tcW w:type="dxa" w:w="3331"/>
+          </w:tcPr>
+          <w:p>
+            <w:r>
+              <w:t>show, seat, booking, attemptId</w:t>
+            </w:r>
+          </w:p>
+        </w:tc>
+        <w:tc>
+          <w:tcPr>
+            <w:tcW w:type="dxa" w:w="3331"/>
+          </w:tcPr>
+          <w:p>
+            <w:r>
+              <w:t>Unique compound index `{ show, seat }` stops duplicate seat claims for a show.</w:t>
+            </w:r>
+          </w:p>
+        </w:tc>
+      </w:tr>
+      <w:tr>
+        <w:trPr>
+          <w:cantSplit/>
+        </w:trPr>
+        <w:tc>
+          <w:tcPr>
+            <w:tcW w:type="dxa" w:w="3331"/>
+          </w:tcPr>
+          <w:p>
+            <w:r>
+              <w:t>Booking</w:t>
+            </w:r>
+          </w:p>
+        </w:tc>
+        <w:tc>
+          <w:tcPr>
+            <w:tcW w:type="dxa" w:w="3331"/>
+          </w:tcPr>
+          <w:p>
+            <w:r>
+              <w:t>user, movie, show, theatre, showDate, showTime, seats[], totalAmount, status, paymentStatus, bookingCode</w:t>
+            </w:r>
+          </w:p>
+        </w:tc>
+        <w:tc>
+          <w:tcPr>
+            <w:tcW w:type="dxa" w:w="3331"/>
+          </w:tcPr>
+          <w:p>
+            <w:r>
+              <w:t>Links user/movie/show; bookingCode is unique; cancellation releases its seat reservations.</w:t>
+            </w:r>
+          </w:p>
+        </w:tc>
+      </w:tr>
+      <w:tr>
+        <w:trPr>
+          <w:cantSplit/>
+        </w:trPr>
+        <w:tc>
+          <w:tcPr>
+            <w:tcW w:type="dxa" w:w="3331"/>
+          </w:tcPr>
+          <w:p>
+            <w:r>
+              <w:t>Payment</w:t>
+            </w:r>
+          </w:p>
+        </w:tc>
+        <w:tc>
+          <w:tcPr>
+            <w:tcW w:type="dxa" w:w="3331"/>
+          </w:tcPr>
+          <w:p>
+            <w:r>
+              <w:t>booking, user, amount, currency, method, status, reference</w:t>
+            </w:r>
+          </w:p>
+        </w:tc>
+        <w:tc>
+          <w:tcPr>
+            <w:tcW w:type="dxa" w:w="3331"/>
+          </w:tcPr>
+          <w:p>
+            <w:r>
+              <w:t>DEMO method only; simulated success/refund; no external charge.</w:t>
+            </w:r>
+          </w:p>
+        </w:tc>
+      </w:tr>
+      <w:tr>
+        <w:trPr>
+          <w:cantSplit/>
+        </w:trPr>
+        <w:tc>
+          <w:tcPr>
+            <w:tcW w:type="dxa" w:w="3331"/>
+          </w:tcPr>
+          <w:p>
+            <w:r>
+              <w:t>Notification</w:t>
+            </w:r>
+          </w:p>
+        </w:tc>
+        <w:tc>
+          <w:tcPr>
+            <w:tcW w:type="dxa" w:w="3331"/>
+          </w:tcPr>
+          <w:p>
+            <w:r>
+              <w:t>user, title, message, type, readAt, booking</w:t>
+            </w:r>
+          </w:p>
+        </w:tc>
+        <w:tc>
+          <w:tcPr>
+            <w:tcW w:type="dxa" w:w="3331"/>
+          </w:tcPr>
+          <w:p>
+            <w:r>
+              <w:t>Persistent user-specific booking/cancellation notices with unread tracking.</w:t>
             </w:r>
           </w:p>
         </w:tc>
@@ -2658,12 +2770,7 @@
         <w:jc w:val="center"/>
       </w:pPr>
       <w:r>
-        <w:rPr>
-          <w:i/>
-          <w:color w:val="6E6F80"/>
-          <w:sz w:val="16"/>
-        </w:rPr>
-        <w:t>Figure 3. Main user booking flow. If authentication is required, the user can sign in and return to the booking modal to confirm.</w:t>
+        <w:t>Figure 3. Customer booking and admin-management paths, including realtime seat refresh and cancellation.</w:t>
       </w:r>
     </w:p>
     <w:p>
@@ -2680,7 +2787,7 @@
         <w:spacing w:after="40"/>
       </w:pPr>
       <w:r>
-        <w:t>Browse seeded movie cards with genre, runtime, rating, language/certificate and starting ticket price.</w:t>
+        <w:t>Browse movie cards with genre, runtime, rating, language/certificate and starting ticket price.</w:t>
       </w:r>
     </w:p>
     <w:p>
@@ -2689,7 +2796,7 @@
         <w:spacing w:after="40"/>
       </w:pPr>
       <w:r>
-        <w:t>Search movie titles and filter by one genre.</w:t>
+        <w:t>Search by title and filter by genre, language and city; scheduled shows can be filtered by movie, city, theatre and date.</w:t>
       </w:r>
     </w:p>
     <w:p>
@@ -2698,7 +2805,7 @@
         <w:spacing w:after="40"/>
       </w:pPr>
       <w:r>
-        <w:t>Register an account and sign in with email/password.</w:t>
+        <w:t>Register and sign in with email/password; passwords are hashed with bcryptjs and protected routes require JWT.</w:t>
       </w:r>
     </w:p>
     <w:p>
@@ -2707,7 +2814,7 @@
         <w:spacing w:after="40"/>
       </w:pPr>
       <w:r>
-        <w:t>Choose a date and one of the demo showtime choices.</w:t>
+        <w:t>Browse MongoDB-backed show records that include theatre, city, screen, date, time and price.</w:t>
       </w:r>
     </w:p>
     <w:p>
@@ -2716,7 +2823,7 @@
         <w:spacing w:after="40"/>
       </w:pPr>
       <w:r>
-        <w:t>Select multiple seat labels from the seat map and see a calculated total.</w:t>
+        <w:t>Load the show-specific seat map from the API and receive Socket.IO updates after a booking or cancellation.</w:t>
       </w:r>
     </w:p>
     <w:p>
@@ -2725,7 +2832,7 @@
         <w:spacing w:after="40"/>
       </w:pPr>
       <w:r>
-        <w:t>Submit booking requests with JWT; server validates basic seat format and rejects seats already stored in confirmed bookings for the selected movie/date/showtime.</w:t>
+        <w:t>Confirm a booking with server validation and unique show-seat reservation records; duplicate seat attempts return a conflict response.</w:t>
       </w:r>
     </w:p>
     <w:p>
@@ -2734,7 +2841,7 @@
         <w:spacing w:after="40"/>
       </w:pPr>
       <w:r>
-        <w:t>Review saved bookings and their confirmation codes under My Tickets.</w:t>
+        <w:t>View saved bookings, booking codes, payment simulation status and notifications; cancel confirmed bookings to release reservations.</w:t>
       </w:r>
     </w:p>
     <w:p>
@@ -2743,7 +2850,7 @@
         <w:spacing w:after="40"/>
       </w:pPr>
       <w:r>
-        <w:t>Show helpful messages for common validation or API failures.</w:t>
+        <w:t>Use an admin-only dashboard to create/read/update/delete movie records, create/update/deactivate theatres, schedule/edit/cancel shows and review bookings.</w:t>
       </w:r>
     </w:p>
     <w:p>
@@ -2766,6 +2873,10 @@
         <w:gridCol w:w="4997"/>
       </w:tblGrid>
       <w:tr>
+        <w:trPr>
+          <w:tblHeader w:val="true"/>
+          <w:cantSplit/>
+        </w:trPr>
         <w:tc>
           <w:tcPr>
             <w:tcW w:type="dxa" w:w="2160"/>
@@ -2777,7 +2888,6 @@
               <w:rPr>
                 <w:b/>
                 <w:color w:val="FFFFFF"/>
-                <w:sz w:val="16"/>
               </w:rPr>
               <w:t>Role</w:t>
             </w:r>
@@ -2794,27 +2904,23 @@
               <w:rPr>
                 <w:b/>
                 <w:color w:val="FFFFFF"/>
-                <w:sz w:val="16"/>
               </w:rPr>
-              <w:t>Current responsibilities</w:t>
+              <w:t>Responsibilities</w:t>
             </w:r>
           </w:p>
         </w:tc>
       </w:tr>
       <w:tr>
+        <w:trPr>
+          <w:cantSplit/>
+        </w:trPr>
         <w:tc>
           <w:tcPr>
             <w:tcW w:type="dxa" w:w="2160"/>
             <w:vAlign w:val="center"/>
           </w:tcPr>
           <w:p>
-            <w:pPr>
-              <w:spacing w:after="20" w:before="20"/>
-            </w:pPr>
-            <w:r>
-              <w:rPr>
-                <w:sz w:val="16"/>
-              </w:rPr>
+            <w:r>
               <w:t>Visitor</w:t>
             </w:r>
           </w:p>
@@ -2825,19 +2931,16 @@
             <w:vAlign w:val="center"/>
           </w:tcPr>
           <w:p>
-            <w:pPr>
-              <w:spacing w:after="20" w:before="20"/>
-            </w:pPr>
-            <w:r>
-              <w:rPr>
-                <w:sz w:val="16"/>
-              </w:rPr>
-              <w:t>Browse/search/filter movies and inspect movie details; authentication is required before a booking is saved.</w:t>
+            <w:r>
+              <w:t>Browse and filter movies, theatres and scheduled shows; requires login to book.</w:t>
             </w:r>
           </w:p>
         </w:tc>
       </w:tr>
       <w:tr>
+        <w:trPr>
+          <w:cantSplit/>
+        </w:trPr>
         <w:tc>
           <w:tcPr>
             <w:tcW w:type="dxa" w:w="2160"/>
@@ -2845,13 +2948,7 @@
             <w:shd w:fill="F4F2F9"/>
           </w:tcPr>
           <w:p>
-            <w:pPr>
-              <w:spacing w:after="20" w:before="20"/>
-            </w:pPr>
-            <w:r>
-              <w:rPr>
-                <w:sz w:val="16"/>
-              </w:rPr>
+            <w:r>
               <w:t>Registered user</w:t>
             </w:r>
           </w:p>
@@ -2863,33 +2960,24 @@
             <w:shd w:fill="F4F2F9"/>
           </w:tcPr>
           <w:p>
-            <w:pPr>
-              <w:spacing w:after="20" w:before="20"/>
-            </w:pPr>
-            <w:r>
-              <w:rPr>
-                <w:sz w:val="16"/>
-              </w:rPr>
-              <w:t>Log in, create bookings and view only their own booking history.</w:t>
+            <w:r>
+              <w:t>Manage own bookings, simulate checkout, view own booking/payment/notification records and cancel confirmed bookings.</w:t>
             </w:r>
           </w:p>
         </w:tc>
       </w:tr>
       <w:tr>
+        <w:trPr>
+          <w:cantSplit/>
+        </w:trPr>
         <w:tc>
           <w:tcPr>
             <w:tcW w:type="dxa" w:w="2160"/>
             <w:vAlign w:val="center"/>
           </w:tcPr>
           <w:p>
-            <w:pPr>
-              <w:spacing w:after="20" w:before="20"/>
-            </w:pPr>
-            <w:r>
-              <w:rPr>
-                <w:sz w:val="16"/>
-              </w:rPr>
-              <w:t>Application/API</w:t>
+            <w:r>
+              <w:t>Administrator</w:t>
             </w:r>
           </w:p>
         </w:tc>
@@ -2899,19 +2987,16 @@
             <w:vAlign w:val="center"/>
           </w:tcPr>
           <w:p>
-            <w:pPr>
-              <w:spacing w:after="20" w:before="20"/>
-            </w:pPr>
-            <w:r>
-              <w:rPr>
-                <w:sz w:val="16"/>
-              </w:rPr>
-              <w:t>Validate request data, verify JWT, calculate total price, check existing seats and return responses.</w:t>
+            <w:r>
+              <w:t>Access role-protected AdminPanel; create/update/delete movies, create/update/deactivate theatres, schedule/edit/cancel shows and inspect bookings/statistics.</w:t>
             </w:r>
           </w:p>
         </w:tc>
       </w:tr>
       <w:tr>
+        <w:trPr>
+          <w:cantSplit/>
+        </w:trPr>
         <w:tc>
           <w:tcPr>
             <w:tcW w:type="dxa" w:w="2160"/>
@@ -2919,14 +3004,8 @@
             <w:shd w:fill="F4F2F9"/>
           </w:tcPr>
           <w:p>
-            <w:pPr>
-              <w:spacing w:after="20" w:before="20"/>
-            </w:pPr>
-            <w:r>
-              <w:rPr>
-                <w:sz w:val="16"/>
-              </w:rPr>
-              <w:t>Developer / maintainer</w:t>
+            <w:r>
+              <w:t>Application/API</w:t>
             </w:r>
           </w:p>
         </w:tc>
@@ -2937,33 +3016,24 @@
             <w:shd w:fill="F4F2F9"/>
           </w:tcPr>
           <w:p>
-            <w:pPr>
-              <w:spacing w:after="20" w:before="20"/>
-            </w:pPr>
-            <w:r>
-              <w:rPr>
-                <w:sz w:val="16"/>
-              </w:rPr>
-              <w:t>Configure environment variables, seed sample data, run tests, update code and protect secrets.</w:t>
+            <w:r>
+              <w:t>Validate requests, enforce JWT/role checks, reserve seats, write demo payments/notifications and broadcast seat status changes.</w:t>
             </w:r>
           </w:p>
         </w:tc>
       </w:tr>
       <w:tr>
+        <w:trPr>
+          <w:cantSplit/>
+        </w:trPr>
         <w:tc>
           <w:tcPr>
             <w:tcW w:type="dxa" w:w="2160"/>
             <w:vAlign w:val="center"/>
           </w:tcPr>
           <w:p>
-            <w:pPr>
-              <w:spacing w:after="20" w:before="20"/>
-            </w:pPr>
-            <w:r>
-              <w:rPr>
-                <w:sz w:val="16"/>
-              </w:rPr>
-              <w:t>Administrator</w:t>
+            <w:r>
+              <w:t>Developer / maintainer</w:t>
             </w:r>
           </w:p>
         </w:tc>
@@ -2973,14 +3043,8 @@
             <w:vAlign w:val="center"/>
           </w:tcPr>
           <w:p>
-            <w:pPr>
-              <w:spacing w:after="20" w:before="20"/>
-            </w:pPr>
-            <w:r>
-              <w:rPr>
-                <w:sz w:val="16"/>
-              </w:rPr>
-              <w:t>No administrative UI is implemented in this MVP; the `role` field exists for future extension.</w:t>
+            <w:r>
+              <w:t>Configure secrets, review Atlas access rules, run tests, manage deployments and protect privileged roles.</w:t>
             </w:r>
           </w:p>
         </w:tc>
@@ -3045,20 +3109,12 @@
         <w:jc w:val="center"/>
       </w:pPr>
       <w:r>
-        <w:rPr>
-          <w:i/>
-          <w:color w:val="6E6F80"/>
-          <w:sz w:val="16"/>
-        </w:rPr>
-        <w:t>Figure 4. Adapted MVC/request-handling view of the current implementation.</w:t>
+        <w:t>Figure 4. MVC/request-handling view including JWT middleware, admin authorization, Mongoose models and Socket.IO seat events.</w:t>
       </w:r>
     </w:p>
     <w:p>
       <w:r>
-        <w:rPr>
-          <w:i w:val="0"/>
-        </w:rPr>
-        <w:t>Model: Mongoose schemas in `server/models/` define User, Movie and Booking data. Controller/request-handler logic: asynchronous route handlers in `server/routes/` validate requests and coordinate model operations. View: the user-facing view is implemented in React under `client/src/`; the backend itself returns JSON rather than rendering server-side HTML. This is an MVC-inspired separation, although the current MVP keeps controller logic inside route modules rather than maintaining a separate controllers folder.</w:t>
+        <w:t>Model layer: Mongoose schemas in `server/models/` define User, Movie, Theatre, Show, Booking, SeatReservation, Payment and Notification. Controller/request-handler logic: handlers in `server/routes/` validate requests, enforce user/admin permissions, coordinate database writes and persist notifications. View layer: React components under `client/src/` render the catalogue, booking modal, My Tickets, notifications and AdminPanel. Socket.IO broadcasts `seats-updated` to clients watching a show. The API returns JSON rather than server-rendered HTML.</w:t>
       </w:r>
     </w:p>
     <w:p>
@@ -3075,7 +3131,7 @@
         <w:spacing w:after="40"/>
       </w:pPr>
       <w:r>
-        <w:t>Passwords are hashed before being saved; the plaintext password is not stored.</w:t>
+        <w:t>Passwords are hashed with bcryptjs before storage; plaintext passwords are not saved.</w:t>
       </w:r>
     </w:p>
     <w:p>
@@ -3084,7 +3140,7 @@
         <w:spacing w:after="40"/>
       </w:pPr>
       <w:r>
-        <w:t>JWT authentication is required for booking creation and retrieving the signed-in user’s bookings.</w:t>
+        <w:t>JWT authentication protects booking, cancellation, payment-history and notification endpoints; admin routes also require the stored admin role.</w:t>
       </w:r>
     </w:p>
     <w:p>
@@ -3093,7 +3149,7 @@
         <w:spacing w:after="40"/>
       </w:pPr>
       <w:r>
-        <w:t>The booking endpoint validates required fields, duplicate seats and seat-label format.</w:t>
+        <w:t>Requests validate required fields, seat counts, screen seat labels and object IDs; unique indexes prevent a duplicated seat claim for the same show.</w:t>
       </w:r>
     </w:p>
     <w:p>
@@ -3102,7 +3158,7 @@
         <w:spacing w:after="40"/>
       </w:pPr>
       <w:r>
-        <w:t>Never commit `.env` files or secrets; change the sample JWT secret before any hosted deployment.</w:t>
+        <w:t>Never commit `.env` files or secrets. Use private Render environment variables and keep MongoDB credentials out of GitHub and screenshots.</w:t>
       </w:r>
     </w:p>
     <w:p>
@@ -3111,7 +3167,7 @@
         <w:spacing w:after="40"/>
       </w:pPr>
       <w:r>
-        <w:t>Known risk: availability check and booking insert are separate operations, not an atomic transaction. Two concurrent requests could race. Real ticketing needs transactional/unique reservation logic, rate limiting and broader input validation.</w:t>
+        <w:t>The show-seat unique index is the final guard against two requests reserving the same seat. However, booking, payment and notification writes span multiple collections and are not wrapped in one multi-document transaction; the project is a student demo rather than a production ticketing service. Production use also needs stronger admin provisioning, audit logging, monitoring and payment-provider verification.</w:t>
       </w:r>
     </w:p>
     <w:p>
@@ -3140,21 +3196,20 @@
         <w:gridCol w:w="9994"/>
       </w:tblGrid>
       <w:tr>
+        <w:trPr>
+          <w:tblHeader w:val="true"/>
+          <w:cantSplit/>
+        </w:trPr>
         <w:tc>
           <w:tcPr>
             <w:tcW w:type="dxa" w:w="9994"/>
             <w:shd w:fill="F4F2F8"/>
           </w:tcPr>
           <w:p>
-            <w:pPr>
-              <w:spacing w:after="40" w:before="40"/>
-            </w:pPr>
-            <w:r/>
             <w:r>
               <w:rPr>
-                <w:rFonts w:ascii="Consolas" w:hAnsi="Consolas" w:eastAsia="Consolas"/>
-                <w:color w:val="2F2B3D"/>
-                <w:sz w:val="16"/>
+                <w:b w:val="0"/>
+                <w:color w:val="191C26"/>
               </w:rPr>
               <w:t>IMovies/</w:t>
               <w:br/>
@@ -3162,41 +3217,39 @@
               <w:br/>
               <w:t>│   ├── src/App.jsx</w:t>
               <w:br/>
+              <w:t>│   ├── src/AdminPanel.jsx</w:t>
+              <w:br/>
               <w:t>│   ├── src/main.jsx</w:t>
               <w:br/>
               <w:t>│   ├── src/styles.css</w:t>
               <w:br/>
-              <w:t>│   ├── index.html</w:t>
+              <w:t>│   ├── vite.config.js</w:t>
               <w:br/>
               <w:t>│   └── package.json</w:t>
               <w:br/>
               <w:t>├── server/</w:t>
               <w:br/>
-              <w:t>│   ├── data/movies.json</w:t>
+              <w:t>│   ├── models/ (User, Movie, Theatre, Show, SeatReservation, Booking, Payment, Notification)</w:t>
+              <w:br/>
+              <w:t>│   ├── routes/ (auth, movies, theatres, shows, bookings, payments, notifications, admin)</w:t>
               <w:br/>
               <w:t>│   ├── middleware/auth.js</w:t>
               <w:br/>
-              <w:t>│   ├── models/User.js</w:t>
+              <w:t>│   ├── lib/seatUtils.js</w:t>
               <w:br/>
-              <w:t>│   ├── models/Movie.js</w:t>
+              <w:t>│   ├── tests/seatUtils.test.js</w:t>
               <w:br/>
-              <w:t>│   ├── models/Booking.js</w:t>
+              <w:t>│   ├── data/movies.json</w:t>
               <w:br/>
-              <w:t>│   ├── routes/auth.js</w:t>
+              <w:t>│   ├── bootstrapData.js</w:t>
               <w:br/>
-              <w:t>│   ├── routes/movies.js</w:t>
+              <w:t>│   └── index.js</w:t>
               <w:br/>
-              <w:t>│   ├── routes/bookings.js</w:t>
+              <w:t>├── assets/diagrams/ and assets/previews/</w:t>
               <w:br/>
-              <w:t>│   ├── index.js</w:t>
+              <w:t>├── docs/ (report, tests, deploy, admin, demo)</w:t>
               <w:br/>
-              <w:t>│   ├── seed.js</w:t>
-              <w:br/>
-              <w:t>│   └── package.json</w:t>
-              <w:br/>
-              <w:t>├── docs/</w:t>
-              <w:br/>
-              <w:t>└── assets/</w:t>
+              <w:t>├── README.md, LICENSE, .gitignore</w:t>
             </w:r>
           </w:p>
         </w:tc>
@@ -3257,7 +3310,7 @@
         <w:spacing w:after="40"/>
       </w:pPr>
       <w:r>
-        <w:t>Run `npm install`, then `npm run seed` to insert six sample movie records, then `npm run dev`.</w:t>
+        <w:t>Run `npm install`, then `npm run seed` and `npm run dev`. The seed helper adds sample movies only if the movie collection is empty, and sample theatres/shows only if those collections are empty; it does not intentionally delete existing data.</w:t>
       </w:r>
     </w:p>
     <w:tbl>
@@ -3270,6 +3323,10 @@
         <w:gridCol w:w="9994"/>
       </w:tblGrid>
       <w:tr>
+        <w:trPr>
+          <w:tblHeader w:val="true"/>
+          <w:cantSplit/>
+        </w:trPr>
         <w:tc>
           <w:tcPr>
             <w:tcW w:type="dxa" w:w="9994"/>
@@ -3279,11 +3336,17 @@
             <w:pPr>
               <w:spacing w:after="40" w:before="40"/>
             </w:pPr>
-            <w:r/>
+            <w:r>
+              <w:rPr>
+                <w:b w:val="0"/>
+                <w:color w:val="191C26"/>
+              </w:rPr>
+            </w:r>
             <w:r>
               <w:rPr>
                 <w:rFonts w:ascii="Consolas" w:hAnsi="Consolas" w:eastAsia="Consolas"/>
-                <w:color w:val="2F2B3D"/>
+                <w:b w:val="0"/>
+                <w:color w:val="191C26"/>
                 <w:sz w:val="16"/>
               </w:rPr>
               <w:t>cd server</w:t>
@@ -3350,6 +3413,10 @@
         <w:gridCol w:w="9994"/>
       </w:tblGrid>
       <w:tr>
+        <w:trPr>
+          <w:tblHeader w:val="true"/>
+          <w:cantSplit/>
+        </w:trPr>
         <w:tc>
           <w:tcPr>
             <w:tcW w:type="dxa" w:w="9994"/>
@@ -3359,11 +3426,17 @@
             <w:pPr>
               <w:spacing w:after="40" w:before="40"/>
             </w:pPr>
-            <w:r/>
+            <w:r>
+              <w:rPr>
+                <w:b w:val="0"/>
+                <w:color w:val="191C26"/>
+              </w:rPr>
+            </w:r>
             <w:r>
               <w:rPr>
                 <w:rFonts w:ascii="Consolas" w:hAnsi="Consolas" w:eastAsia="Consolas"/>
-                <w:color w:val="2F2B3D"/>
+                <w:b w:val="0"/>
+                <w:color w:val="191C26"/>
                 <w:sz w:val="16"/>
               </w:rPr>
               <w:t>cd client</w:t>
@@ -3404,6 +3477,10 @@
         <w:gridCol w:w="3331"/>
       </w:tblGrid>
       <w:tr>
+        <w:trPr>
+          <w:tblHeader w:val="true"/>
+          <w:cantSplit/>
+        </w:trPr>
         <w:tc>
           <w:tcPr>
             <w:tcW w:type="dxa" w:w="2448"/>
@@ -3457,6 +3534,9 @@
         </w:tc>
       </w:tr>
       <w:tr>
+        <w:trPr>
+          <w:cantSplit/>
+        </w:trPr>
         <w:tc>
           <w:tcPr>
             <w:tcW w:type="dxa" w:w="2448"/>
@@ -3510,6 +3590,9 @@
         </w:tc>
       </w:tr>
       <w:tr>
+        <w:trPr>
+          <w:cantSplit/>
+        </w:trPr>
         <w:tc>
           <w:tcPr>
             <w:tcW w:type="dxa" w:w="2448"/>
@@ -3566,6 +3649,9 @@
         </w:tc>
       </w:tr>
       <w:tr>
+        <w:trPr>
+          <w:cantSplit/>
+        </w:trPr>
         <w:tc>
           <w:tcPr>
             <w:tcW w:type="dxa" w:w="2448"/>
@@ -3619,6 +3705,9 @@
         </w:tc>
       </w:tr>
       <w:tr>
+        <w:trPr>
+          <w:cantSplit/>
+        </w:trPr>
         <w:tc>
           <w:tcPr>
             <w:tcW w:type="dxa" w:w="2448"/>
@@ -3662,19 +3751,16 @@
             <w:shd w:fill="F4F2F9"/>
           </w:tcPr>
           <w:p>
-            <w:pPr>
-              <w:spacing w:after="20" w:before="20"/>
-            </w:pPr>
-            <w:r>
-              <w:rPr>
-                <w:sz w:val="15"/>
-              </w:rPr>
-              <w:t>Restrict to known origins in production</w:t>
+            <w:r>
+              <w:t>Allowed browser origin(s); exact Vercel production origin, no trailing slash. Localhost defaults are included in development.</w:t>
             </w:r>
           </w:p>
         </w:tc>
       </w:tr>
       <w:tr>
+        <w:trPr>
+          <w:cantSplit/>
+        </w:trPr>
         <w:tc>
           <w:tcPr>
             <w:tcW w:type="dxa" w:w="2448"/>
@@ -3743,10 +3829,7 @@
     </w:p>
     <w:p>
       <w:r>
-        <w:rPr>
-          <w:i w:val="0"/>
-        </w:rPr>
-        <w:t>The backend entry point is `server/index.js`. It loads environment configuration, connects to MongoDB, enables JSON parsing and CORS, mounts route modules, and defines a common error response. It listens on port 8000 by default after a successful database connection.</w:t>
+        <w:t>The backend entry point is `server/index.js`. It connects to MongoDB, applies CORS and JSON middleware, applies global/auth/booking rate limits, mounts route modules and starts HTTP plus Socket.IO after MongoDB connects. On startup, `bootstrapData.js` fills missing sample data for an empty development/demo database.</w:t>
       </w:r>
     </w:p>
     <w:p>
@@ -3771,6 +3854,10 @@
         <w:gridCol w:w="2498"/>
       </w:tblGrid>
       <w:tr>
+        <w:trPr>
+          <w:tblHeader w:val="true"/>
+          <w:cantSplit/>
+        </w:trPr>
         <w:tc>
           <w:tcPr>
             <w:tcW w:type="dxa" w:w="936"/>
@@ -3782,7 +3869,6 @@
               <w:rPr>
                 <w:b/>
                 <w:color w:val="FFFFFF"/>
-                <w:sz w:val="14"/>
               </w:rPr>
               <w:t>Method</w:t>
             </w:r>
@@ -3799,7 +3885,6 @@
               <w:rPr>
                 <w:b/>
                 <w:color w:val="FFFFFF"/>
-                <w:sz w:val="14"/>
               </w:rPr>
               <w:t>Endpoint</w:t>
             </w:r>
@@ -3816,7 +3901,6 @@
               <w:rPr>
                 <w:b/>
                 <w:color w:val="FFFFFF"/>
-                <w:sz w:val="14"/>
               </w:rPr>
               <w:t>Purpose</w:t>
             </w:r>
@@ -3833,7 +3917,6 @@
               <w:rPr>
                 <w:b/>
                 <w:color w:val="FFFFFF"/>
-                <w:sz w:val="14"/>
               </w:rPr>
               <w:t>Access</w:t>
             </w:r>
@@ -3841,19 +3924,16 @@
         </w:tc>
       </w:tr>
       <w:tr>
+        <w:trPr>
+          <w:cantSplit/>
+        </w:trPr>
         <w:tc>
           <w:tcPr>
             <w:tcW w:type="dxa" w:w="936"/>
             <w:vAlign w:val="center"/>
           </w:tcPr>
           <w:p>
-            <w:pPr>
-              <w:spacing w:after="20" w:before="20"/>
-            </w:pPr>
-            <w:r>
-              <w:rPr>
-                <w:sz w:val="14"/>
-              </w:rPr>
+            <w:r>
               <w:t>GET</w:t>
             </w:r>
           </w:p>
@@ -3864,13 +3944,7 @@
             <w:vAlign w:val="center"/>
           </w:tcPr>
           <w:p>
-            <w:pPr>
-              <w:spacing w:after="20" w:before="20"/>
-            </w:pPr>
-            <w:r>
-              <w:rPr>
-                <w:sz w:val="14"/>
-              </w:rPr>
+            <w:r>
               <w:t>/api/health</w:t>
             </w:r>
           </w:p>
@@ -3881,14 +3955,8 @@
             <w:vAlign w:val="center"/>
           </w:tcPr>
           <w:p>
-            <w:pPr>
-              <w:spacing w:after="20" w:before="20"/>
-            </w:pPr>
-            <w:r>
-              <w:rPr>
-                <w:sz w:val="14"/>
-              </w:rPr>
-              <w:t>Return API status</w:t>
+            <w:r>
+              <w:t>Health and realtime status</w:t>
             </w:r>
           </w:p>
         </w:tc>
@@ -3898,19 +3966,16 @@
             <w:vAlign w:val="center"/>
           </w:tcPr>
           <w:p>
-            <w:pPr>
-              <w:spacing w:after="20" w:before="20"/>
-            </w:pPr>
-            <w:r>
-              <w:rPr>
-                <w:sz w:val="14"/>
-              </w:rPr>
+            <w:r>
               <w:t>Public</w:t>
             </w:r>
           </w:p>
         </w:tc>
       </w:tr>
       <w:tr>
+        <w:trPr>
+          <w:cantSplit/>
+        </w:trPr>
         <w:tc>
           <w:tcPr>
             <w:tcW w:type="dxa" w:w="936"/>
@@ -3918,13 +3983,7 @@
             <w:shd w:fill="F4F2F9"/>
           </w:tcPr>
           <w:p>
-            <w:pPr>
-              <w:spacing w:after="20" w:before="20"/>
-            </w:pPr>
-            <w:r>
-              <w:rPr>
-                <w:sz w:val="14"/>
-              </w:rPr>
+            <w:r>
               <w:t>GET</w:t>
             </w:r>
           </w:p>
@@ -3936,13 +3995,7 @@
             <w:shd w:fill="F4F2F9"/>
           </w:tcPr>
           <w:p>
-            <w:pPr>
-              <w:spacing w:after="20" w:before="20"/>
-            </w:pPr>
-            <w:r>
-              <w:rPr>
-                <w:sz w:val="14"/>
-              </w:rPr>
+            <w:r>
               <w:t>/api/movies</w:t>
             </w:r>
           </w:p>
@@ -3954,14 +4007,8 @@
             <w:shd w:fill="F4F2F9"/>
           </w:tcPr>
           <w:p>
-            <w:pPr>
-              <w:spacing w:after="20" w:before="20"/>
-            </w:pPr>
-            <w:r>
-              <w:rPr>
-                <w:sz w:val="14"/>
-              </w:rPr>
-              <w:t>List catalogue; optional search and genre query</w:t>
+            <w:r>
+              <w:t>List/search/filter by genre, language and city; paginate</w:t>
             </w:r>
           </w:p>
         </w:tc>
@@ -3972,32 +4019,23 @@
             <w:shd w:fill="F4F2F9"/>
           </w:tcPr>
           <w:p>
-            <w:pPr>
-              <w:spacing w:after="20" w:before="20"/>
-            </w:pPr>
-            <w:r>
-              <w:rPr>
-                <w:sz w:val="14"/>
-              </w:rPr>
+            <w:r>
               <w:t>Public</w:t>
             </w:r>
           </w:p>
         </w:tc>
       </w:tr>
       <w:tr>
+        <w:trPr>
+          <w:cantSplit/>
+        </w:trPr>
         <w:tc>
           <w:tcPr>
             <w:tcW w:type="dxa" w:w="936"/>
             <w:vAlign w:val="center"/>
           </w:tcPr>
           <w:p>
-            <w:pPr>
-              <w:spacing w:after="20" w:before="20"/>
-            </w:pPr>
-            <w:r>
-              <w:rPr>
-                <w:sz w:val="14"/>
-              </w:rPr>
+            <w:r>
               <w:t>GET</w:t>
             </w:r>
           </w:p>
@@ -4008,13 +4046,7 @@
             <w:vAlign w:val="center"/>
           </w:tcPr>
           <w:p>
-            <w:pPr>
-              <w:spacing w:after="20" w:before="20"/>
-            </w:pPr>
-            <w:r>
-              <w:rPr>
-                <w:sz w:val="14"/>
-              </w:rPr>
+            <w:r>
               <w:t>/api/movies/:id</w:t>
             </w:r>
           </w:p>
@@ -4025,14 +4057,8 @@
             <w:vAlign w:val="center"/>
           </w:tcPr>
           <w:p>
-            <w:pPr>
-              <w:spacing w:after="20" w:before="20"/>
-            </w:pPr>
-            <w:r>
-              <w:rPr>
-                <w:sz w:val="14"/>
-              </w:rPr>
-              <w:t>Fetch one movie by ID</w:t>
+            <w:r>
+              <w:t>Fetch movie details</w:t>
             </w:r>
           </w:p>
         </w:tc>
@@ -4042,19 +4068,16 @@
             <w:vAlign w:val="center"/>
           </w:tcPr>
           <w:p>
-            <w:pPr>
-              <w:spacing w:after="20" w:before="20"/>
-            </w:pPr>
-            <w:r>
-              <w:rPr>
-                <w:sz w:val="14"/>
-              </w:rPr>
+            <w:r>
               <w:t>Public</w:t>
             </w:r>
           </w:p>
         </w:tc>
       </w:tr>
       <w:tr>
+        <w:trPr>
+          <w:cantSplit/>
+        </w:trPr>
         <w:tc>
           <w:tcPr>
             <w:tcW w:type="dxa" w:w="936"/>
@@ -4062,14 +4085,8 @@
             <w:shd w:fill="F4F2F9"/>
           </w:tcPr>
           <w:p>
-            <w:pPr>
-              <w:spacing w:after="20" w:before="20"/>
-            </w:pPr>
-            <w:r>
-              <w:rPr>
-                <w:sz w:val="14"/>
-              </w:rPr>
-              <w:t>POST</w:t>
+            <w:r>
+              <w:t>GET</w:t>
             </w:r>
           </w:p>
         </w:tc>
@@ -4080,14 +4097,8 @@
             <w:shd w:fill="F4F2F9"/>
           </w:tcPr>
           <w:p>
-            <w:pPr>
-              <w:spacing w:after="20" w:before="20"/>
-            </w:pPr>
-            <w:r>
-              <w:rPr>
-                <w:sz w:val="14"/>
-              </w:rPr>
-              <w:t>/api/auth/register</w:t>
+            <w:r>
+              <w:t>/api/theatres</w:t>
             </w:r>
           </w:p>
         </w:tc>
@@ -4098,14 +4109,8 @@
             <w:shd w:fill="F4F2F9"/>
           </w:tcPr>
           <w:p>
-            <w:pPr>
-              <w:spacing w:after="20" w:before="20"/>
-            </w:pPr>
-            <w:r>
-              <w:rPr>
-                <w:sz w:val="14"/>
-              </w:rPr>
-              <w:t>Create account and return token</w:t>
+            <w:r>
+              <w:t>List active theatres; filter by city/name and paginate</w:t>
             </w:r>
           </w:p>
         </w:tc>
@@ -4116,33 +4121,24 @@
             <w:shd w:fill="F4F2F9"/>
           </w:tcPr>
           <w:p>
-            <w:pPr>
-              <w:spacing w:after="20" w:before="20"/>
-            </w:pPr>
-            <w:r>
-              <w:rPr>
-                <w:sz w:val="14"/>
-              </w:rPr>
+            <w:r>
               <w:t>Public</w:t>
             </w:r>
           </w:p>
         </w:tc>
       </w:tr>
       <w:tr>
+        <w:trPr>
+          <w:cantSplit/>
+        </w:trPr>
         <w:tc>
           <w:tcPr>
             <w:tcW w:type="dxa" w:w="936"/>
             <w:vAlign w:val="center"/>
           </w:tcPr>
           <w:p>
-            <w:pPr>
-              <w:spacing w:after="20" w:before="20"/>
-            </w:pPr>
-            <w:r>
-              <w:rPr>
-                <w:sz w:val="14"/>
-              </w:rPr>
-              <w:t>POST</w:t>
+            <w:r>
+              <w:t>GET</w:t>
             </w:r>
           </w:p>
         </w:tc>
@@ -4152,14 +4148,8 @@
             <w:vAlign w:val="center"/>
           </w:tcPr>
           <w:p>
-            <w:pPr>
-              <w:spacing w:after="20" w:before="20"/>
-            </w:pPr>
-            <w:r>
-              <w:rPr>
-                <w:sz w:val="14"/>
-              </w:rPr>
-              <w:t>/api/auth/login</w:t>
+            <w:r>
+              <w:t>/api/shows</w:t>
             </w:r>
           </w:p>
         </w:tc>
@@ -4169,14 +4159,8 @@
             <w:vAlign w:val="center"/>
           </w:tcPr>
           <w:p>
-            <w:pPr>
-              <w:spacing w:after="20" w:before="20"/>
-            </w:pPr>
-            <w:r>
-              <w:rPr>
-                <w:sz w:val="14"/>
-              </w:rPr>
-              <w:t>Validate credentials and return token</w:t>
+            <w:r>
+              <w:t>Filter shows by movie/date/theatre/city and paginate</w:t>
             </w:r>
           </w:p>
         </w:tc>
@@ -4186,19 +4170,16 @@
             <w:vAlign w:val="center"/>
           </w:tcPr>
           <w:p>
-            <w:pPr>
-              <w:spacing w:after="20" w:before="20"/>
-            </w:pPr>
-            <w:r>
-              <w:rPr>
-                <w:sz w:val="14"/>
-              </w:rPr>
+            <w:r>
               <w:t>Public</w:t>
             </w:r>
           </w:p>
         </w:tc>
       </w:tr>
       <w:tr>
+        <w:trPr>
+          <w:cantSplit/>
+        </w:trPr>
         <w:tc>
           <w:tcPr>
             <w:tcW w:type="dxa" w:w="936"/>
@@ -4206,13 +4187,7 @@
             <w:shd w:fill="F4F2F9"/>
           </w:tcPr>
           <w:p>
-            <w:pPr>
-              <w:spacing w:after="20" w:before="20"/>
-            </w:pPr>
-            <w:r>
-              <w:rPr>
-                <w:sz w:val="14"/>
-              </w:rPr>
+            <w:r>
               <w:t>GET</w:t>
             </w:r>
           </w:p>
@@ -4224,14 +4199,8 @@
             <w:shd w:fill="F4F2F9"/>
           </w:tcPr>
           <w:p>
-            <w:pPr>
-              <w:spacing w:after="20" w:before="20"/>
-            </w:pPr>
-            <w:r>
-              <w:rPr>
-                <w:sz w:val="14"/>
-              </w:rPr>
-              <w:t>/api/auth/me</w:t>
+            <w:r>
+              <w:t>/api/shows/:id/seats</w:t>
             </w:r>
           </w:p>
         </w:tc>
@@ -4242,14 +4211,8 @@
             <w:shd w:fill="F4F2F9"/>
           </w:tcPr>
           <w:p>
-            <w:pPr>
-              <w:spacing w:after="20" w:before="20"/>
-            </w:pPr>
-            <w:r>
-              <w:rPr>
-                <w:sz w:val="14"/>
-              </w:rPr>
-              <w:t>Return current user profile</w:t>
+            <w:r>
+              <w:t>Return seat labels and occupied seats</w:t>
             </w:r>
           </w:p>
         </w:tc>
@@ -4260,32 +4223,23 @@
             <w:shd w:fill="F4F2F9"/>
           </w:tcPr>
           <w:p>
-            <w:pPr>
-              <w:spacing w:after="20" w:before="20"/>
-            </w:pPr>
-            <w:r>
-              <w:rPr>
-                <w:sz w:val="14"/>
-              </w:rPr>
-              <w:t>JWT</w:t>
+            <w:r>
+              <w:t>Public</w:t>
             </w:r>
           </w:p>
         </w:tc>
       </w:tr>
       <w:tr>
+        <w:trPr>
+          <w:cantSplit/>
+        </w:trPr>
         <w:tc>
           <w:tcPr>
             <w:tcW w:type="dxa" w:w="936"/>
             <w:vAlign w:val="center"/>
           </w:tcPr>
           <w:p>
-            <w:pPr>
-              <w:spacing w:after="20" w:before="20"/>
-            </w:pPr>
-            <w:r>
-              <w:rPr>
-                <w:sz w:val="14"/>
-              </w:rPr>
+            <w:r>
               <w:t>POST</w:t>
             </w:r>
           </w:p>
@@ -4296,14 +4250,8 @@
             <w:vAlign w:val="center"/>
           </w:tcPr>
           <w:p>
-            <w:pPr>
-              <w:spacing w:after="20" w:before="20"/>
-            </w:pPr>
-            <w:r>
-              <w:rPr>
-                <w:sz w:val="14"/>
-              </w:rPr>
-              <w:t>/api/bookings</w:t>
+            <w:r>
+              <w:t>/api/auth/register</w:t>
             </w:r>
           </w:p>
         </w:tc>
@@ -4313,14 +4261,8 @@
             <w:vAlign w:val="center"/>
           </w:tcPr>
           <w:p>
-            <w:pPr>
-              <w:spacing w:after="20" w:before="20"/>
-            </w:pPr>
-            <w:r>
-              <w:rPr>
-                <w:sz w:val="14"/>
-              </w:rPr>
-              <w:t>Validate seats and create booking</w:t>
+            <w:r>
+              <w:t>Create account with hashed password and JWT</w:t>
             </w:r>
           </w:p>
         </w:tc>
@@ -4330,19 +4272,16 @@
             <w:vAlign w:val="center"/>
           </w:tcPr>
           <w:p>
-            <w:pPr>
-              <w:spacing w:after="20" w:before="20"/>
-            </w:pPr>
-            <w:r>
-              <w:rPr>
-                <w:sz w:val="14"/>
-              </w:rPr>
-              <w:t>JWT</w:t>
+            <w:r>
+              <w:t>Public, rate-limited</w:t>
             </w:r>
           </w:p>
         </w:tc>
       </w:tr>
       <w:tr>
+        <w:trPr>
+          <w:cantSplit/>
+        </w:trPr>
         <w:tc>
           <w:tcPr>
             <w:tcW w:type="dxa" w:w="936"/>
@@ -4350,14 +4289,8 @@
             <w:shd w:fill="F4F2F9"/>
           </w:tcPr>
           <w:p>
-            <w:pPr>
-              <w:spacing w:after="20" w:before="20"/>
-            </w:pPr>
-            <w:r>
-              <w:rPr>
-                <w:sz w:val="14"/>
-              </w:rPr>
-              <w:t>GET</w:t>
+            <w:r>
+              <w:t>POST</w:t>
             </w:r>
           </w:p>
         </w:tc>
@@ -4368,14 +4301,8 @@
             <w:shd w:fill="F4F2F9"/>
           </w:tcPr>
           <w:p>
-            <w:pPr>
-              <w:spacing w:after="20" w:before="20"/>
-            </w:pPr>
-            <w:r>
-              <w:rPr>
-                <w:sz w:val="14"/>
-              </w:rPr>
-              <w:t>/api/bookings/my</w:t>
+            <w:r>
+              <w:t>/api/auth/login</w:t>
             </w:r>
           </w:p>
         </w:tc>
@@ -4386,14 +4313,8 @@
             <w:shd w:fill="F4F2F9"/>
           </w:tcPr>
           <w:p>
-            <w:pPr>
-              <w:spacing w:after="20" w:before="20"/>
-            </w:pPr>
-            <w:r>
-              <w:rPr>
-                <w:sz w:val="14"/>
-              </w:rPr>
-              <w:t>List bookings belonging to current user</w:t>
+            <w:r>
+              <w:t>Validate credentials and return role/JWT</w:t>
             </w:r>
           </w:p>
         </w:tc>
@@ -4404,14 +4325,593 @@
             <w:shd w:fill="F4F2F9"/>
           </w:tcPr>
           <w:p>
-            <w:pPr>
-              <w:spacing w:after="20" w:before="20"/>
-            </w:pPr>
-            <w:r>
-              <w:rPr>
-                <w:sz w:val="14"/>
-              </w:rPr>
+            <w:r>
+              <w:t>Public, rate-limited</w:t>
+            </w:r>
+          </w:p>
+        </w:tc>
+      </w:tr>
+      <w:tr>
+        <w:trPr>
+          <w:cantSplit/>
+        </w:trPr>
+        <w:tc>
+          <w:tcPr>
+            <w:tcW w:type="dxa" w:w="2498"/>
+          </w:tcPr>
+          <w:p>
+            <w:r>
+              <w:t>GET</w:t>
+            </w:r>
+          </w:p>
+        </w:tc>
+        <w:tc>
+          <w:tcPr>
+            <w:tcW w:type="dxa" w:w="2498"/>
+          </w:tcPr>
+          <w:p>
+            <w:r>
+              <w:t>/api/auth/me</w:t>
+            </w:r>
+          </w:p>
+        </w:tc>
+        <w:tc>
+          <w:tcPr>
+            <w:tcW w:type="dxa" w:w="2498"/>
+          </w:tcPr>
+          <w:p>
+            <w:r>
+              <w:t>Current profile</w:t>
+            </w:r>
+          </w:p>
+        </w:tc>
+        <w:tc>
+          <w:tcPr>
+            <w:tcW w:type="dxa" w:w="2498"/>
+          </w:tcPr>
+          <w:p>
+            <w:r>
               <w:t>JWT</w:t>
+            </w:r>
+          </w:p>
+        </w:tc>
+      </w:tr>
+      <w:tr>
+        <w:trPr>
+          <w:cantSplit/>
+        </w:trPr>
+        <w:tc>
+          <w:tcPr>
+            <w:tcW w:type="dxa" w:w="2498"/>
+          </w:tcPr>
+          <w:p>
+            <w:r>
+              <w:t>POST</w:t>
+            </w:r>
+          </w:p>
+        </w:tc>
+        <w:tc>
+          <w:tcPr>
+            <w:tcW w:type="dxa" w:w="2498"/>
+          </w:tcPr>
+          <w:p>
+            <w:r>
+              <w:t>/api/bookings</w:t>
+            </w:r>
+          </w:p>
+        </w:tc>
+        <w:tc>
+          <w:tcPr>
+            <w:tcW w:type="dxa" w:w="2498"/>
+          </w:tcPr>
+          <w:p>
+            <w:r>
+              <w:t>Reserve seat(s), confirm demo booking/payment, notification</w:t>
+            </w:r>
+          </w:p>
+        </w:tc>
+        <w:tc>
+          <w:tcPr>
+            <w:tcW w:type="dxa" w:w="2498"/>
+          </w:tcPr>
+          <w:p>
+            <w:r>
+              <w:t>JWT, rate-limited</w:t>
+            </w:r>
+          </w:p>
+        </w:tc>
+      </w:tr>
+      <w:tr>
+        <w:trPr>
+          <w:cantSplit/>
+        </w:trPr>
+        <w:tc>
+          <w:tcPr>
+            <w:tcW w:type="dxa" w:w="2498"/>
+          </w:tcPr>
+          <w:p>
+            <w:r>
+              <w:t>GET</w:t>
+            </w:r>
+          </w:p>
+        </w:tc>
+        <w:tc>
+          <w:tcPr>
+            <w:tcW w:type="dxa" w:w="2498"/>
+          </w:tcPr>
+          <w:p>
+            <w:r>
+              <w:t>/api/bookings/my</w:t>
+            </w:r>
+          </w:p>
+        </w:tc>
+        <w:tc>
+          <w:tcPr>
+            <w:tcW w:type="dxa" w:w="2498"/>
+          </w:tcPr>
+          <w:p>
+            <w:r>
+              <w:t>Current user's bookings with pagination</w:t>
+            </w:r>
+          </w:p>
+        </w:tc>
+        <w:tc>
+          <w:tcPr>
+            <w:tcW w:type="dxa" w:w="2498"/>
+          </w:tcPr>
+          <w:p>
+            <w:r>
+              <w:t>JWT</w:t>
+            </w:r>
+          </w:p>
+        </w:tc>
+      </w:tr>
+      <w:tr>
+        <w:trPr>
+          <w:cantSplit/>
+        </w:trPr>
+        <w:tc>
+          <w:tcPr>
+            <w:tcW w:type="dxa" w:w="2498"/>
+          </w:tcPr>
+          <w:p>
+            <w:r>
+              <w:t>PATCH</w:t>
+            </w:r>
+          </w:p>
+        </w:tc>
+        <w:tc>
+          <w:tcPr>
+            <w:tcW w:type="dxa" w:w="2498"/>
+          </w:tcPr>
+          <w:p>
+            <w:r>
+              <w:t>/api/bookings/:id/cancel</w:t>
+            </w:r>
+          </w:p>
+        </w:tc>
+        <w:tc>
+          <w:tcPr>
+            <w:tcW w:type="dxa" w:w="2498"/>
+          </w:tcPr>
+          <w:p>
+            <w:r>
+              <w:t>Cancel owned booking and release seat reservation</w:t>
+            </w:r>
+          </w:p>
+        </w:tc>
+        <w:tc>
+          <w:tcPr>
+            <w:tcW w:type="dxa" w:w="2498"/>
+          </w:tcPr>
+          <w:p>
+            <w:r>
+              <w:t>Owner/admin</w:t>
+            </w:r>
+          </w:p>
+        </w:tc>
+      </w:tr>
+      <w:tr>
+        <w:trPr>
+          <w:cantSplit/>
+        </w:trPr>
+        <w:tc>
+          <w:tcPr>
+            <w:tcW w:type="dxa" w:w="2498"/>
+          </w:tcPr>
+          <w:p>
+            <w:r>
+              <w:t>GET</w:t>
+            </w:r>
+          </w:p>
+        </w:tc>
+        <w:tc>
+          <w:tcPr>
+            <w:tcW w:type="dxa" w:w="2498"/>
+          </w:tcPr>
+          <w:p>
+            <w:r>
+              <w:t>/api/notifications/my</w:t>
+            </w:r>
+          </w:p>
+        </w:tc>
+        <w:tc>
+          <w:tcPr>
+            <w:tcW w:type="dxa" w:w="2498"/>
+          </w:tcPr>
+          <w:p>
+            <w:r>
+              <w:t>List user's notifications and unread count</w:t>
+            </w:r>
+          </w:p>
+        </w:tc>
+        <w:tc>
+          <w:tcPr>
+            <w:tcW w:type="dxa" w:w="2498"/>
+          </w:tcPr>
+          <w:p>
+            <w:r>
+              <w:t>JWT</w:t>
+            </w:r>
+          </w:p>
+        </w:tc>
+      </w:tr>
+      <w:tr>
+        <w:trPr>
+          <w:cantSplit/>
+        </w:trPr>
+        <w:tc>
+          <w:tcPr>
+            <w:tcW w:type="dxa" w:w="2498"/>
+          </w:tcPr>
+          <w:p>
+            <w:r>
+              <w:t>PATCH</w:t>
+            </w:r>
+          </w:p>
+        </w:tc>
+        <w:tc>
+          <w:tcPr>
+            <w:tcW w:type="dxa" w:w="2498"/>
+          </w:tcPr>
+          <w:p>
+            <w:r>
+              <w:t>/api/notifications/:id/read</w:t>
+            </w:r>
+          </w:p>
+        </w:tc>
+        <w:tc>
+          <w:tcPr>
+            <w:tcW w:type="dxa" w:w="2498"/>
+          </w:tcPr>
+          <w:p>
+            <w:r>
+              <w:t>Mark one notification read</w:t>
+            </w:r>
+          </w:p>
+        </w:tc>
+        <w:tc>
+          <w:tcPr>
+            <w:tcW w:type="dxa" w:w="2498"/>
+          </w:tcPr>
+          <w:p>
+            <w:r>
+              <w:t>JWT</w:t>
+            </w:r>
+          </w:p>
+        </w:tc>
+      </w:tr>
+      <w:tr>
+        <w:trPr>
+          <w:cantSplit/>
+        </w:trPr>
+        <w:tc>
+          <w:tcPr>
+            <w:tcW w:type="dxa" w:w="2498"/>
+          </w:tcPr>
+          <w:p>
+            <w:r>
+              <w:t>PATCH</w:t>
+            </w:r>
+          </w:p>
+        </w:tc>
+        <w:tc>
+          <w:tcPr>
+            <w:tcW w:type="dxa" w:w="2498"/>
+          </w:tcPr>
+          <w:p>
+            <w:r>
+              <w:t>/api/notifications/read-all</w:t>
+            </w:r>
+          </w:p>
+        </w:tc>
+        <w:tc>
+          <w:tcPr>
+            <w:tcW w:type="dxa" w:w="2498"/>
+          </w:tcPr>
+          <w:p>
+            <w:r>
+              <w:t>Mark all notifications read</w:t>
+            </w:r>
+          </w:p>
+        </w:tc>
+        <w:tc>
+          <w:tcPr>
+            <w:tcW w:type="dxa" w:w="2498"/>
+          </w:tcPr>
+          <w:p>
+            <w:r>
+              <w:t>JWT</w:t>
+            </w:r>
+          </w:p>
+        </w:tc>
+      </w:tr>
+      <w:tr>
+        <w:trPr>
+          <w:cantSplit/>
+        </w:trPr>
+        <w:tc>
+          <w:tcPr>
+            <w:tcW w:type="dxa" w:w="2498"/>
+          </w:tcPr>
+          <w:p>
+            <w:r>
+              <w:t>GET</w:t>
+            </w:r>
+          </w:p>
+        </w:tc>
+        <w:tc>
+          <w:tcPr>
+            <w:tcW w:type="dxa" w:w="2498"/>
+          </w:tcPr>
+          <w:p>
+            <w:r>
+              <w:t>/api/payments/my</w:t>
+            </w:r>
+          </w:p>
+        </w:tc>
+        <w:tc>
+          <w:tcPr>
+            <w:tcW w:type="dxa" w:w="2498"/>
+          </w:tcPr>
+          <w:p>
+            <w:r>
+              <w:t>List own payment-simulation records</w:t>
+            </w:r>
+          </w:p>
+        </w:tc>
+        <w:tc>
+          <w:tcPr>
+            <w:tcW w:type="dxa" w:w="2498"/>
+          </w:tcPr>
+          <w:p>
+            <w:r>
+              <w:t>JWT</w:t>
+            </w:r>
+          </w:p>
+        </w:tc>
+      </w:tr>
+      <w:tr>
+        <w:trPr>
+          <w:cantSplit/>
+        </w:trPr>
+        <w:tc>
+          <w:tcPr>
+            <w:tcW w:type="dxa" w:w="2498"/>
+          </w:tcPr>
+          <w:p>
+            <w:r>
+              <w:t>GET</w:t>
+            </w:r>
+          </w:p>
+        </w:tc>
+        <w:tc>
+          <w:tcPr>
+            <w:tcW w:type="dxa" w:w="2498"/>
+          </w:tcPr>
+          <w:p>
+            <w:r>
+              <w:t>/api/admin/stats</w:t>
+            </w:r>
+          </w:p>
+        </w:tc>
+        <w:tc>
+          <w:tcPr>
+            <w:tcW w:type="dxa" w:w="2498"/>
+          </w:tcPr>
+          <w:p>
+            <w:r>
+              <w:t>Counts and demo totals</w:t>
+            </w:r>
+          </w:p>
+        </w:tc>
+        <w:tc>
+          <w:tcPr>
+            <w:tcW w:type="dxa" w:w="2498"/>
+          </w:tcPr>
+          <w:p>
+            <w:r>
+              <w:t>Admin</w:t>
+            </w:r>
+          </w:p>
+        </w:tc>
+      </w:tr>
+      <w:tr>
+        <w:trPr>
+          <w:cantSplit/>
+        </w:trPr>
+        <w:tc>
+          <w:tcPr>
+            <w:tcW w:type="dxa" w:w="2498"/>
+          </w:tcPr>
+          <w:p>
+            <w:r>
+              <w:t>CRUD</w:t>
+            </w:r>
+          </w:p>
+        </w:tc>
+        <w:tc>
+          <w:tcPr>
+            <w:tcW w:type="dxa" w:w="2498"/>
+          </w:tcPr>
+          <w:p>
+            <w:r>
+              <w:t>/api/admin/movies</w:t>
+            </w:r>
+          </w:p>
+        </w:tc>
+        <w:tc>
+          <w:tcPr>
+            <w:tcW w:type="dxa" w:w="2498"/>
+          </w:tcPr>
+          <w:p>
+            <w:r>
+              <w:t>Create/read/update/delete movies</w:t>
+            </w:r>
+          </w:p>
+        </w:tc>
+        <w:tc>
+          <w:tcPr>
+            <w:tcW w:type="dxa" w:w="2498"/>
+          </w:tcPr>
+          <w:p>
+            <w:r>
+              <w:t>Admin</w:t>
+            </w:r>
+          </w:p>
+        </w:tc>
+      </w:tr>
+      <w:tr>
+        <w:trPr>
+          <w:cantSplit/>
+        </w:trPr>
+        <w:tc>
+          <w:tcPr>
+            <w:tcW w:type="dxa" w:w="2498"/>
+          </w:tcPr>
+          <w:p>
+            <w:r>
+              <w:t>CRUD</w:t>
+            </w:r>
+          </w:p>
+        </w:tc>
+        <w:tc>
+          <w:tcPr>
+            <w:tcW w:type="dxa" w:w="2498"/>
+          </w:tcPr>
+          <w:p>
+            <w:r>
+              <w:t>/api/admin/theatres</w:t>
+            </w:r>
+          </w:p>
+        </w:tc>
+        <w:tc>
+          <w:tcPr>
+            <w:tcW w:type="dxa" w:w="2498"/>
+          </w:tcPr>
+          <w:p>
+            <w:r>
+              <w:t>Create/read/update/deactivate theatres</w:t>
+            </w:r>
+          </w:p>
+        </w:tc>
+        <w:tc>
+          <w:tcPr>
+            <w:tcW w:type="dxa" w:w="2498"/>
+          </w:tcPr>
+          <w:p>
+            <w:r>
+              <w:t>Admin</w:t>
+            </w:r>
+          </w:p>
+        </w:tc>
+      </w:tr>
+      <w:tr>
+        <w:trPr>
+          <w:cantSplit/>
+        </w:trPr>
+        <w:tc>
+          <w:tcPr>
+            <w:tcW w:type="dxa" w:w="2498"/>
+          </w:tcPr>
+          <w:p>
+            <w:r>
+              <w:t>CRUD</w:t>
+            </w:r>
+          </w:p>
+        </w:tc>
+        <w:tc>
+          <w:tcPr>
+            <w:tcW w:type="dxa" w:w="2498"/>
+          </w:tcPr>
+          <w:p>
+            <w:r>
+              <w:t>/api/admin/shows</w:t>
+            </w:r>
+          </w:p>
+        </w:tc>
+        <w:tc>
+          <w:tcPr>
+            <w:tcW w:type="dxa" w:w="2498"/>
+          </w:tcPr>
+          <w:p>
+            <w:r>
+              <w:t>Create/read/update/cancel scheduled shows</w:t>
+            </w:r>
+          </w:p>
+        </w:tc>
+        <w:tc>
+          <w:tcPr>
+            <w:tcW w:type="dxa" w:w="2498"/>
+          </w:tcPr>
+          <w:p>
+            <w:r>
+              <w:t>Admin</w:t>
+            </w:r>
+          </w:p>
+        </w:tc>
+      </w:tr>
+      <w:tr>
+        <w:trPr>
+          <w:cantSplit/>
+        </w:trPr>
+        <w:tc>
+          <w:tcPr>
+            <w:tcW w:type="dxa" w:w="2498"/>
+          </w:tcPr>
+          <w:p>
+            <w:r>
+              <w:t>GET</w:t>
+            </w:r>
+          </w:p>
+        </w:tc>
+        <w:tc>
+          <w:tcPr>
+            <w:tcW w:type="dxa" w:w="2498"/>
+          </w:tcPr>
+          <w:p>
+            <w:r>
+              <w:t>/api/admin/bookings</w:t>
+            </w:r>
+          </w:p>
+        </w:tc>
+        <w:tc>
+          <w:tcPr>
+            <w:tcW w:type="dxa" w:w="2498"/>
+          </w:tcPr>
+          <w:p>
+            <w:r>
+              <w:t>Review booking records</w:t>
+            </w:r>
+          </w:p>
+        </w:tc>
+        <w:tc>
+          <w:tcPr>
+            <w:tcW w:type="dxa" w:w="2498"/>
+          </w:tcPr>
+          <w:p>
+            <w:r>
+              <w:t>Admin</w:t>
             </w:r>
           </w:p>
         </w:tc>
@@ -4440,21 +4940,20 @@
         <w:gridCol w:w="9994"/>
       </w:tblGrid>
       <w:tr>
+        <w:trPr>
+          <w:tblHeader w:val="true"/>
+          <w:cantSplit/>
+        </w:trPr>
         <w:tc>
           <w:tcPr>
             <w:tcW w:type="dxa" w:w="9994"/>
             <w:shd w:fill="F4F2F8"/>
           </w:tcPr>
           <w:p>
-            <w:pPr>
-              <w:spacing w:after="40" w:before="40"/>
-            </w:pPr>
-            <w:r/>
             <w:r>
               <w:rPr>
-                <w:rFonts w:ascii="Consolas" w:hAnsi="Consolas" w:eastAsia="Consolas"/>
-                <w:color w:val="2F2B3D"/>
-                <w:sz w:val="16"/>
+                <w:b w:val="0"/>
+                <w:color w:val="191C26"/>
               </w:rPr>
               <w:t>POST /api/bookings</w:t>
               <w:br/>
@@ -4465,15 +4964,16 @@
               <w:br/>
               <w:t>{</w:t>
               <w:br/>
-              <w:t xml:space="preserve">  "movieId": "&lt;MongoDB movie id&gt;",</w:t>
+              <w:t xml:space="preserve">  "showId": "&lt;MongoDB show id&gt;",</w:t>
               <w:br/>
-              <w:t xml:space="preserve">  "showDate": "2026-10-24",</w:t>
+              <w:t xml:space="preserve">  "seats": ["A1", "A2"],</w:t>
               <w:br/>
-              <w:t xml:space="preserve">  "showTime": "4:30 PM",</w:t>
-              <w:br/>
-              <w:t xml:space="preserve">  "seats": ["C3", "C4"]</w:t>
+              <w:t xml:space="preserve">  "paymentMode": "demo"</w:t>
               <w:br/>
               <w:t>}</w:t>
+              <w:br/>
+              <w:br/>
+              <w:t>The server validates the show and screen seat labels, reserves each show-seat pair, creates a booking, stores a simulated payment record and notification, and emits `seats-updated`. No real payment is processed.</w:t>
             </w:r>
           </w:p>
         </w:tc>
@@ -4486,10 +4986,7 @@
     </w:p>
     <w:p>
       <w:r>
-        <w:rPr>
-          <w:i w:val="0"/>
-        </w:rPr>
-        <w:t>The API validates that a movie, date, showtime and at least one seat are supplied; checks for duplicate/invalid seat labels; loads the movie; queries bookings for already-confirmed selected seats for the same movie, date and time; calculates `movie.price × number of seats`; and returns the created booking and confirmation code. This is a demo flow and is not a replacement for a transaction-safe production ticket inventory system.</w:t>
+        <w:t>The scheduled-show workflow receives `showId` and a seat array. The API loads the show and movie, validates that seat labels belong to the screen, creates unique SeatReservation records, rejects duplicate claims, saves a confirmed booking and a simulated Payment record, then writes a notification. It emits `seats-updated` to clients viewing the show. The response explicitly notes that no money was charged.</w:t>
       </w:r>
     </w:p>
     <w:p>
@@ -4515,7 +5012,7 @@
         <w:spacing w:after="40"/>
       </w:pPr>
       <w:r>
-        <w:t>401 Unauthorized: missing, invalid or expired JWT for protected routes.</w:t>
+        <w:t>401 Unauthorized: missing, invalid or expired JWT on a protected route.</w:t>
       </w:r>
     </w:p>
     <w:p>
@@ -4524,7 +5021,7 @@
         <w:spacing w:after="40"/>
       </w:pPr>
       <w:r>
-        <w:t>404 Not Found: movie ID does not resolve to a movie.</w:t>
+        <w:t>404 Not Found: the requested movie, show, theatre or booking does not exist or is no longer available.</w:t>
       </w:r>
     </w:p>
     <w:p>
@@ -4533,7 +5030,7 @@
         <w:spacing w:after="40"/>
       </w:pPr>
       <w:r>
-        <w:t>409 Conflict: duplicate email during registration or one or more seats are already booked.</w:t>
+        <w:t>409 Conflict: duplicate email, duplicate seat reservation, or an operation blocked by linked records.</w:t>
       </w:r>
     </w:p>
     <w:p>
@@ -4542,7 +5039,7 @@
         <w:spacing w:after="40"/>
       </w:pPr>
       <w:r>
-        <w:t>500 Internal Server Error: unexpected server or database error.</w:t>
+        <w:t>429 Too Many Requests: authentication, booking or API rate limit reached. 500 Internal Server Error: unexpected service/database failure.</w:t>
       </w:r>
     </w:p>
     <w:p>
@@ -4563,10 +5060,7 @@
     </w:p>
     <w:p>
       <w:r>
-        <w:rPr>
-          <w:i w:val="0"/>
-        </w:rPr>
-        <w:t>MongoDB stores documents in three collections. Mongoose schemas specify required fields, string trimming/lowercasing, enum values, references and timestamps. User passwords are stored as `passwordHash`. Booking records include an array of selected seats, total amount, status and a human-readable code.</w:t>
+        <w:t>The data layer uses eight collections: User, Movie, Theatre, Show, SeatReservation, Booking, Payment and Notification. Mongoose schemas define required fields, references, enum values, timestamps and indexes. User passwords are stored as passwordHash. Show records hold cinema scheduling and seat-layout metadata; SeatReservation has a unique `{ show, seat }` index; Payment records are labelled simulated and do not represent a real charge.</w:t>
       </w:r>
     </w:p>
     <w:p>
@@ -4579,10 +5073,7 @@
     </w:p>
     <w:p>
       <w:r>
-        <w:rPr>
-          <w:i w:val="0"/>
-        </w:rPr>
-        <w:t>`server/data/movies.json` contains six sample movie records with titles, descriptions, genres, durations, ratings, languages/certificates, poster URLs and ticket prices. `server/seed.js` loads this JSON file and inserts the records into MongoDB. It is suitable for local demonstration only. Running the seed script again deletes and replaces existing movie documents, so do not run it against a database containing records you need to retain.</w:t>
+        <w:t>`server/data/movies.json` contains six sample movies with titles, descriptions, genres, durations, ratings, languages/certificates, poster URLs and prices. `server/seed.js` calls the non-destructive `ensureDemoData()` helper. If theatres/shows are absent, sample Bhopal theatres and a week of sample shows are created for demonstration.</w:t>
       </w:r>
     </w:p>
     <w:tbl>
@@ -4599,6 +5090,10 @@
         <w:gridCol w:w="2498"/>
       </w:tblGrid>
       <w:tr>
+        <w:trPr>
+          <w:tblHeader w:val="true"/>
+          <w:cantSplit/>
+        </w:trPr>
         <w:tc>
           <w:tcPr>
             <w:tcW w:type="dxa" w:w="3888"/>
@@ -4669,6 +5164,9 @@
         </w:tc>
       </w:tr>
       <w:tr>
+        <w:trPr>
+          <w:cantSplit/>
+        </w:trPr>
         <w:tc>
           <w:tcPr>
             <w:tcW w:type="dxa" w:w="3888"/>
@@ -4739,6 +5237,9 @@
         </w:tc>
       </w:tr>
       <w:tr>
+        <w:trPr>
+          <w:cantSplit/>
+        </w:trPr>
         <w:tc>
           <w:tcPr>
             <w:tcW w:type="dxa" w:w="3888"/>
@@ -4813,6 +5314,9 @@
         </w:tc>
       </w:tr>
       <w:tr>
+        <w:trPr>
+          <w:cantSplit/>
+        </w:trPr>
         <w:tc>
           <w:tcPr>
             <w:tcW w:type="dxa" w:w="3888"/>
@@ -4883,6 +5387,9 @@
         </w:tc>
       </w:tr>
       <w:tr>
+        <w:trPr>
+          <w:cantSplit/>
+        </w:trPr>
         <w:tc>
           <w:tcPr>
             <w:tcW w:type="dxa" w:w="3888"/>
@@ -4957,6 +5464,9 @@
         </w:tc>
       </w:tr>
       <w:tr>
+        <w:trPr>
+          <w:cantSplit/>
+        </w:trPr>
         <w:tc>
           <w:tcPr>
             <w:tcW w:type="dxa" w:w="3888"/>
@@ -5027,6 +5537,9 @@
         </w:tc>
       </w:tr>
       <w:tr>
+        <w:trPr>
+          <w:cantSplit/>
+        </w:trPr>
         <w:tc>
           <w:tcPr>
             <w:tcW w:type="dxa" w:w="3888"/>
@@ -5116,10 +5629,7 @@
     </w:p>
     <w:p>
       <w:r>
-        <w:rPr>
-          <w:i w:val="0"/>
-        </w:rPr>
-        <w:t>Bookings reference both a user and a movie by ObjectId. The “my bookings” endpoint filters by the authenticated user ID, so one user does not receive another user’s booking list from this endpoint. The current code checks previously booked seats but does not make the check-and-insert sequence atomic; this limitation must be addressed before production use.</w:t>
+        <w:t>Bookings reference a user and movie, and scheduled bookings also reference a show and theatre. The “my bookings” endpoint filters by authenticated user ID. SeatReservation has a unique index on show and seat; cancellation deletes the booking’s seat reservations so availability is restored. The multiple writes for booking/payment/notification are not wrapped in a single transaction, so the project should not be treated as production-grade inventory/payment software.</w:t>
       </w:r>
     </w:p>
     <w:p>
@@ -5132,10 +5642,7 @@
     </w:p>
     <w:p>
       <w:r>
-        <w:rPr>
-          <w:i w:val="0"/>
-        </w:rPr>
-        <w:t>The frontend is a single-page React application bootstrapped with Vite. `App.jsx` manages the movie catalogue, filters, selected movie, seat selections, authentication modal, booking modal and ticket list. `styles.css` contains the responsive dark-cinema design, and Lucide React provides interface icons.</w:t>
+        <w:t>The frontend is a single-page React application bootstrapped with Vite. `App.jsx` manages catalogue filters, scheduled shows, realtime seat selection, authentication, bookings, cancellation and notifications. `AdminPanel.jsx` provides role-protected catalogue/theatre/show CRUD and a bookings overview. `styles.css` supplies the responsive dark cinema design, Socket.IO Client listens for show-seat events, and Lucide React provides icons.</w:t>
       </w:r>
     </w:p>
     <w:p>
@@ -5152,7 +5659,7 @@
         <w:spacing w:after="40"/>
       </w:pPr>
       <w:r>
-        <w:t>Top navigation with brand, Explore, How it works, My Tickets and login/account controls.</w:t>
+        <w:t>Top navigation with Explore, How it works, My Tickets, notifications, login/account and a role-gated Admin action.</w:t>
       </w:r>
     </w:p>
     <w:p>
@@ -5161,7 +5668,7 @@
         <w:spacing w:after="40"/>
       </w:pPr>
       <w:r>
-        <w:t>Hero section introducing the booking experience.</w:t>
+        <w:t>Hero section introducing the booking experience and featured movie.</w:t>
       </w:r>
     </w:p>
     <w:p>
@@ -5170,7 +5677,7 @@
         <w:spacing w:after="40"/>
       </w:pPr>
       <w:r>
-        <w:t>Movie catalogue cards with metadata, ratings, starting prices, search input and genre chips.</w:t>
+        <w:t>Movie catalogue cards with title search, genre chips, language and city filters, ratings, metadata and starting prices.</w:t>
       </w:r>
     </w:p>
     <w:p>
@@ -5179,7 +5686,7 @@
         <w:spacing w:after="40"/>
       </w:pPr>
       <w:r>
-        <w:t>Booking modal with date picker, showtime selector, seat map, selected seat count and total price.</w:t>
+        <w:t>Booking modal with show date, scheduled theatre/showtime cards, screen layout, live seat map, total amount and clear demo-payment label.</w:t>
       </w:r>
     </w:p>
     <w:p>
@@ -5188,7 +5695,7 @@
         <w:spacing w:after="40"/>
       </w:pPr>
       <w:r>
-        <w:t>Login/register modal for account access.</w:t>
+        <w:t>Login/register modal backed by the JWT authentication API.</w:t>
       </w:r>
     </w:p>
     <w:p>
@@ -5197,7 +5704,7 @@
         <w:spacing w:after="40"/>
       </w:pPr>
       <w:r>
-        <w:t>My Tickets modal with booking code, date/time, seats and total.</w:t>
+        <w:t>My Tickets shows booking code, theatre, date/time, seats, total, payment simulation status and cancellation control; notification modal displays persistent booking/cancellation updates.</w:t>
       </w:r>
     </w:p>
     <w:p>
@@ -5254,12 +5761,7 @@
         <w:jc w:val="center"/>
       </w:pPr>
       <w:r>
-        <w:rPr>
-          <w:i/>
-          <w:color w:val="6E6F80"/>
-          <w:sz w:val="16"/>
-        </w:rPr>
-        <w:t>Figure 5. Illustrative home/catalogue layout. This image was composed as a design preview, not captured from the running React app.</w:t>
+        <w:t>Figure 5. Illustrative home/catalogue preview. It is not a screenshot of the deployed React app.</w:t>
       </w:r>
     </w:p>
     <w:p>
@@ -5316,12 +5818,7 @@
         <w:jc w:val="center"/>
       </w:pPr>
       <w:r>
-        <w:rPr>
-          <w:i/>
-          <w:color w:val="6E6F80"/>
-          <w:sz w:val="16"/>
-        </w:rPr>
-        <w:t>Figure 6. Illustrative booking/seat-selection layout. Seat values shown are examples only.</w:t>
+        <w:t>Figure 6. Illustrative booking/seat-selection preview. The deployed release loads seat availability from MongoDB-backed APIs.</w:t>
       </w:r>
     </w:p>
     <w:p>
@@ -5378,12 +5875,7 @@
         <w:jc w:val="center"/>
       </w:pPr>
       <w:r>
-        <w:rPr>
-          <w:i/>
-          <w:color w:val="6E6F80"/>
-          <w:sz w:val="16"/>
-        </w:rPr>
-        <w:t>Figure 7. Illustrative My Tickets layout; sample booking codes and entries are fictional.</w:t>
+        <w:t>Figure 7. Illustrative My Tickets preview. Replace this image with a real captured ticket after final regression testing.</w:t>
       </w:r>
     </w:p>
     <w:p>
@@ -5408,7 +5900,7 @@
         <w:spacing w:after="40"/>
       </w:pPr>
       <w:r>
-        <w:t>Ensure MongoDB is running and the server `.env` points to the correct database.</w:t>
+        <w:t>Install Node.js 18 or later and ensure `node --version` and `npm --version` work.</w:t>
       </w:r>
     </w:p>
     <w:p>
@@ -5417,7 +5909,7 @@
         <w:spacing w:after="40"/>
       </w:pPr>
       <w:r>
-        <w:t>In terminal 1, navigate to `server/`, run `npm install` once, then `npm run seed` and `npm run dev`.</w:t>
+        <w:t>Start MongoDB or configure an Atlas cluster, then in `server/` run `npm install`, `npm run seed` and `npm run dev`.</w:t>
       </w:r>
     </w:p>
     <w:p>
@@ -5426,7 +5918,7 @@
         <w:spacing w:after="40"/>
       </w:pPr>
       <w:r>
-        <w:t>Check `http://localhost:8000/api/health` returns status `ok`.</w:t>
+        <w:t>Check `http://localhost:8000/api/health` returns `status: ok` and the realtime flag.</w:t>
       </w:r>
     </w:p>
     <w:p>
@@ -5435,7 +5927,7 @@
         <w:spacing w:after="40"/>
       </w:pPr>
       <w:r>
-        <w:t>In terminal 2, navigate to `client/`, create `.env` from `.env.example`, run `npm install` once and `npm run dev`.</w:t>
+        <w:t>In a second terminal, copy the client `.env.example` to `.env`, then run `npm install` and `npm run dev` inside `client/`.</w:t>
       </w:r>
     </w:p>
     <w:p>
@@ -5444,7 +5936,7 @@
         <w:spacing w:after="40"/>
       </w:pPr>
       <w:r>
-        <w:t>Open the Vite development URL (usually `http://localhost:5173`) in Chrome or Firefox.</w:t>
+        <w:t>Open the Vite development URL (usually `http://localhost:5173`) in a modern browser.</w:t>
       </w:r>
     </w:p>
     <w:p>
@@ -5461,7 +5953,7 @@
         <w:spacing w:after="40"/>
       </w:pPr>
       <w:r>
-        <w:t>Browse and filter the movie list; try a title search.</w:t>
+        <w:t>Browse/search/filter movies by title, genre, language and city.</w:t>
       </w:r>
     </w:p>
     <w:p>
@@ -5470,7 +5962,7 @@
         <w:spacing w:after="40"/>
       </w:pPr>
       <w:r>
-        <w:t>Register a demo user with an email you can access, or sign in with an existing local test account.</w:t>
+        <w:t>Register or sign in, then choose a movie, future date and scheduled theatre/showtime.</w:t>
       </w:r>
     </w:p>
     <w:p>
@@ -5479,7 +5971,7 @@
         <w:spacing w:after="40"/>
       </w:pPr>
       <w:r>
-        <w:t>Open a movie, select a future date and showtime, and choose seat labels.</w:t>
+        <w:t>Select available seats; if a seat becomes unavailable, refresh and choose another.</w:t>
       </w:r>
     </w:p>
     <w:p>
@@ -5488,7 +5980,7 @@
         <w:spacing w:after="40"/>
       </w:pPr>
       <w:r>
-        <w:t>Confirm the booking; if a selected seat was booked earlier for that movie/date/time, choose another seat.</w:t>
+        <w:t>Confirm the simulated booking (no real payment); verify a booking record and notification are saved.</w:t>
       </w:r>
     </w:p>
     <w:p>
@@ -5497,7 +5989,7 @@
         <w:spacing w:after="40"/>
       </w:pPr>
       <w:r>
-        <w:t>Open My Tickets and verify the movie, date/time, seat list, booking code and total.</w:t>
+        <w:t>Open My Tickets, test cancellation on a confirmed test booking, and verify its seats become available again.</w:t>
       </w:r>
     </w:p>
     <w:p>
@@ -5526,6 +6018,10 @@
         <w:gridCol w:w="3331"/>
       </w:tblGrid>
       <w:tr>
+        <w:trPr>
+          <w:tblHeader w:val="true"/>
+          <w:cantSplit/>
+        </w:trPr>
         <w:tc>
           <w:tcPr>
             <w:tcW w:type="dxa" w:w="2376"/>
@@ -5579,6 +6075,9 @@
         </w:tc>
       </w:tr>
       <w:tr>
+        <w:trPr>
+          <w:cantSplit/>
+        </w:trPr>
         <w:tc>
           <w:tcPr>
             <w:tcW w:type="dxa" w:w="2376"/>
@@ -5632,6 +6131,9 @@
         </w:tc>
       </w:tr>
       <w:tr>
+        <w:trPr>
+          <w:cantSplit/>
+        </w:trPr>
         <w:tc>
           <w:tcPr>
             <w:tcW w:type="dxa" w:w="2376"/>
@@ -5688,6 +6190,9 @@
         </w:tc>
       </w:tr>
       <w:tr>
+        <w:trPr>
+          <w:cantSplit/>
+        </w:trPr>
         <w:tc>
           <w:tcPr>
             <w:tcW w:type="dxa" w:w="2376"/>
@@ -5741,6 +6246,9 @@
         </w:tc>
       </w:tr>
       <w:tr>
+        <w:trPr>
+          <w:cantSplit/>
+        </w:trPr>
         <w:tc>
           <w:tcPr>
             <w:tcW w:type="dxa" w:w="2376"/>
@@ -5797,6 +6305,9 @@
         </w:tc>
       </w:tr>
       <w:tr>
+        <w:trPr>
+          <w:cantSplit/>
+        </w:trPr>
         <w:tc>
           <w:tcPr>
             <w:tcW w:type="dxa" w:w="2376"/>
@@ -5850,6 +6361,9 @@
         </w:tc>
       </w:tr>
       <w:tr>
+        <w:trPr>
+          <w:cantSplit/>
+        </w:trPr>
         <w:tc>
           <w:tcPr>
             <w:tcW w:type="dxa" w:w="2376"/>
@@ -5926,10 +6440,7 @@
     </w:p>
     <w:p>
       <w:r>
-        <w:rPr>
-          <w:i w:val="0"/>
-        </w:rPr>
-        <w:t>Test execution needs a working Node/npm dependency installation and a reachable MongoDB instance. In the environment used to package this report, the npm dependency install attempt did not finish, and a live MongoDB service was not available. Therefore, no end-to-end pass claim is made here. The manual cases in `docs/TEST_PLAN.md` must be executed and the actual status/results filled in by the project owner.</w:t>
+        <w:t>The expanded source passed static JavaScript syntax checks and five Node.js native helper unit tests in the packaging environment. Network access did not permit a complete npm dependency installation/build here, and the expanded code has not yet been deployed and re-tested against the user’s live services. Therefore this report does not mark live integration tests as passed. Complete `docs/TEST_PLAN.md` after committing the expanded files and waiting for Render/Vercel deployment.</w:t>
       </w:r>
     </w:p>
     <w:p>
@@ -5953,6 +6464,10 @@
         <w:gridCol w:w="3331"/>
       </w:tblGrid>
       <w:tr>
+        <w:trPr>
+          <w:tblHeader w:val="true"/>
+          <w:cantSplit/>
+        </w:trPr>
         <w:tc>
           <w:tcPr>
             <w:tcW w:type="dxa" w:w="2088"/>
@@ -5964,7 +6479,6 @@
               <w:rPr>
                 <w:b/>
                 <w:color w:val="FFFFFF"/>
-                <w:sz w:val="15"/>
               </w:rPr>
               <w:t>Test group</w:t>
             </w:r>
@@ -5981,7 +6495,6 @@
               <w:rPr>
                 <w:b/>
                 <w:color w:val="FFFFFF"/>
-                <w:sz w:val="15"/>
               </w:rPr>
               <w:t>What to verify</w:t>
             </w:r>
@@ -5998,7 +6511,6 @@
               <w:rPr>
                 <w:b/>
                 <w:color w:val="FFFFFF"/>
-                <w:sz w:val="15"/>
               </w:rPr>
               <w:t>Status in this package</w:t>
             </w:r>
@@ -6006,20 +6518,17 @@
         </w:tc>
       </w:tr>
       <w:tr>
+        <w:trPr>
+          <w:cantSplit/>
+        </w:trPr>
         <w:tc>
           <w:tcPr>
             <w:tcW w:type="dxa" w:w="2088"/>
             <w:vAlign w:val="center"/>
           </w:tcPr>
           <w:p>
-            <w:pPr>
-              <w:spacing w:after="20" w:before="20"/>
-            </w:pPr>
-            <w:r>
-              <w:rPr>
-                <w:sz w:val="15"/>
-              </w:rPr>
-              <w:t>Static source review</w:t>
+            <w:r>
+              <w:t>Static source checks</w:t>
             </w:r>
           </w:p>
         </w:tc>
@@ -6029,14 +6538,8 @@
             <w:vAlign w:val="center"/>
           </w:tcPr>
           <w:p>
-            <w:pPr>
-              <w:spacing w:after="20" w:before="20"/>
-            </w:pPr>
-            <w:r>
-              <w:rPr>
-                <w:sz w:val="15"/>
-              </w:rPr>
-              <w:t>Source folders and configuration samples exist</w:t>
+            <w:r>
+              <w:t>Node syntax checks for server files and TypeScript parser syntax pass for JSX/config</w:t>
             </w:r>
           </w:p>
         </w:tc>
@@ -6046,19 +6549,16 @@
             <w:vAlign w:val="center"/>
           </w:tcPr>
           <w:p>
-            <w:pPr>
-              <w:spacing w:after="20" w:before="20"/>
-            </w:pPr>
-            <w:r>
-              <w:rPr>
-                <w:sz w:val="15"/>
-              </w:rPr>
-              <w:t>Packaged; Node syntax checks passed for server JS</w:t>
+            <w:r>
+              <w:t>Passed</w:t>
             </w:r>
           </w:p>
         </w:tc>
       </w:tr>
       <w:tr>
+        <w:trPr>
+          <w:cantSplit/>
+        </w:trPr>
         <w:tc>
           <w:tcPr>
             <w:tcW w:type="dxa" w:w="2088"/>
@@ -6066,14 +6566,8 @@
             <w:shd w:fill="F4F2F9"/>
           </w:tcPr>
           <w:p>
-            <w:pPr>
-              <w:spacing w:after="20" w:before="20"/>
-            </w:pPr>
-            <w:r>
-              <w:rPr>
-                <w:sz w:val="15"/>
-              </w:rPr>
-              <w:t>API availability</w:t>
+            <w:r>
+              <w:t>Unit tests</w:t>
             </w:r>
           </w:p>
         </w:tc>
@@ -6084,14 +6578,8 @@
             <w:shd w:fill="F4F2F9"/>
           </w:tcPr>
           <w:p>
-            <w:pPr>
-              <w:spacing w:after="20" w:before="20"/>
-            </w:pPr>
-            <w:r>
-              <w:rPr>
-                <w:sz w:val="15"/>
-              </w:rPr>
-              <w:t>Health endpoint starts successfully</w:t>
+            <w:r>
+              <w:t>Seat validation/layout and pagination helper tests</w:t>
             </w:r>
           </w:p>
         </w:tc>
@@ -6102,33 +6590,24 @@
             <w:shd w:fill="F4F2F9"/>
           </w:tcPr>
           <w:p>
-            <w:pPr>
-              <w:spacing w:after="20" w:before="20"/>
-            </w:pPr>
-            <w:r>
-              <w:rPr>
-                <w:sz w:val="15"/>
-              </w:rPr>
-              <w:t>Not run live</w:t>
+            <w:r>
+              <w:t>5 passed with Node built-in test runner</w:t>
             </w:r>
           </w:p>
         </w:tc>
       </w:tr>
       <w:tr>
+        <w:trPr>
+          <w:cantSplit/>
+        </w:trPr>
         <w:tc>
           <w:tcPr>
             <w:tcW w:type="dxa" w:w="2088"/>
             <w:vAlign w:val="center"/>
           </w:tcPr>
           <w:p>
-            <w:pPr>
-              <w:spacing w:after="20" w:before="20"/>
-            </w:pPr>
-            <w:r>
-              <w:rPr>
-                <w:sz w:val="15"/>
-              </w:rPr>
-              <w:t>Database integration</w:t>
+            <w:r>
+              <w:t>API availability</w:t>
             </w:r>
           </w:p>
         </w:tc>
@@ -6138,14 +6617,8 @@
             <w:vAlign w:val="center"/>
           </w:tcPr>
           <w:p>
-            <w:pPr>
-              <w:spacing w:after="20" w:before="20"/>
-            </w:pPr>
-            <w:r>
-              <w:rPr>
-                <w:sz w:val="15"/>
-              </w:rPr>
-              <w:t>Seed and movie list read from MongoDB</w:t>
+            <w:r>
+              <w:t>Health/show/theatre endpoints after upgraded Render deploy</w:t>
             </w:r>
           </w:p>
         </w:tc>
@@ -6155,19 +6628,16 @@
             <w:vAlign w:val="center"/>
           </w:tcPr>
           <w:p>
-            <w:pPr>
-              <w:spacing w:after="20" w:before="20"/>
-            </w:pPr>
-            <w:r>
-              <w:rPr>
-                <w:sz w:val="15"/>
-              </w:rPr>
-              <w:t>Not run live</w:t>
+            <w:r>
+              <w:t>Not yet re-tested after updated source upload</w:t>
             </w:r>
           </w:p>
         </w:tc>
       </w:tr>
       <w:tr>
+        <w:trPr>
+          <w:cantSplit/>
+        </w:trPr>
         <w:tc>
           <w:tcPr>
             <w:tcW w:type="dxa" w:w="2088"/>
@@ -6175,14 +6645,8 @@
             <w:shd w:fill="F4F2F9"/>
           </w:tcPr>
           <w:p>
-            <w:pPr>
-              <w:spacing w:after="20" w:before="20"/>
-            </w:pPr>
-            <w:r>
-              <w:rPr>
-                <w:sz w:val="15"/>
-              </w:rPr>
-              <w:t>Authentication</w:t>
+            <w:r>
+              <w:t>Database integration</w:t>
             </w:r>
           </w:p>
         </w:tc>
@@ -6193,14 +6657,8 @@
             <w:shd w:fill="F4F2F9"/>
           </w:tcPr>
           <w:p>
-            <w:pPr>
-              <w:spacing w:after="20" w:before="20"/>
-            </w:pPr>
-            <w:r>
-              <w:rPr>
-                <w:sz w:val="15"/>
-              </w:rPr>
-              <w:t>Register/login/JWT protected routes</w:t>
+            <w:r>
+              <w:t>Bootstrap sample theatres/shows and list existing movies</w:t>
             </w:r>
           </w:p>
         </w:tc>
@@ -6211,33 +6669,24 @@
             <w:shd w:fill="F4F2F9"/>
           </w:tcPr>
           <w:p>
-            <w:pPr>
-              <w:spacing w:after="20" w:before="20"/>
-            </w:pPr>
-            <w:r>
-              <w:rPr>
-                <w:sz w:val="15"/>
-              </w:rPr>
-              <w:t>Not run live</w:t>
+            <w:r>
+              <w:t>Must verify after updated source deploy</w:t>
             </w:r>
           </w:p>
         </w:tc>
       </w:tr>
       <w:tr>
+        <w:trPr>
+          <w:cantSplit/>
+        </w:trPr>
         <w:tc>
           <w:tcPr>
             <w:tcW w:type="dxa" w:w="2088"/>
             <w:vAlign w:val="center"/>
           </w:tcPr>
           <w:p>
-            <w:pPr>
-              <w:spacing w:after="20" w:before="20"/>
-            </w:pPr>
-            <w:r>
-              <w:rPr>
-                <w:sz w:val="15"/>
-              </w:rPr>
-              <w:t>Booking logic</w:t>
+            <w:r>
+              <w:t>Authentication/security</w:t>
             </w:r>
           </w:p>
         </w:tc>
@@ -6247,14 +6696,8 @@
             <w:vAlign w:val="center"/>
           </w:tcPr>
           <w:p>
-            <w:pPr>
-              <w:spacing w:after="20" w:before="20"/>
-            </w:pPr>
-            <w:r>
-              <w:rPr>
-                <w:sz w:val="15"/>
-              </w:rPr>
-              <w:t>Seat validation, duplicate-seat conflict and totals</w:t>
+            <w:r>
+              <w:t>Register/login/JWT, 401/403, rate limiting</w:t>
             </w:r>
           </w:p>
         </w:tc>
@@ -6264,19 +6707,16 @@
             <w:vAlign w:val="center"/>
           </w:tcPr>
           <w:p>
-            <w:pPr>
-              <w:spacing w:after="20" w:before="20"/>
-            </w:pPr>
-            <w:r>
-              <w:rPr>
-                <w:sz w:val="15"/>
-              </w:rPr>
-              <w:t>Not run live</w:t>
+            <w:r>
+              <w:t>Manual verification required after redeploy</w:t>
             </w:r>
           </w:p>
         </w:tc>
       </w:tr>
       <w:tr>
+        <w:trPr>
+          <w:cantSplit/>
+        </w:trPr>
         <w:tc>
           <w:tcPr>
             <w:tcW w:type="dxa" w:w="2088"/>
@@ -6284,14 +6724,8 @@
             <w:shd w:fill="F4F2F9"/>
           </w:tcPr>
           <w:p>
-            <w:pPr>
-              <w:spacing w:after="20" w:before="20"/>
-            </w:pPr>
-            <w:r>
-              <w:rPr>
-                <w:sz w:val="15"/>
-              </w:rPr>
-              <w:t>Frontend</w:t>
+            <w:r>
+              <w:t>Booking/seat controls</w:t>
             </w:r>
           </w:p>
         </w:tc>
@@ -6302,14 +6736,8 @@
             <w:shd w:fill="F4F2F9"/>
           </w:tcPr>
           <w:p>
-            <w:pPr>
-              <w:spacing w:after="20" w:before="20"/>
-            </w:pPr>
-            <w:r>
-              <w:rPr>
-                <w:sz w:val="15"/>
-              </w:rPr>
-              <w:t>Search/filter, modal flow and My Tickets</w:t>
+            <w:r>
+              <w:t>Book/cancel, duplicate seat conflict, show-seat release, Socket.IO updates</w:t>
             </w:r>
           </w:p>
         </w:tc>
@@ -6320,33 +6748,24 @@
             <w:shd w:fill="F4F2F9"/>
           </w:tcPr>
           <w:p>
-            <w:pPr>
-              <w:spacing w:after="20" w:before="20"/>
-            </w:pPr>
-            <w:r>
-              <w:rPr>
-                <w:sz w:val="15"/>
-              </w:rPr>
-              <w:t>Not run live</w:t>
+            <w:r>
+              <w:t>Manual multi-session verification required</w:t>
             </w:r>
           </w:p>
         </w:tc>
       </w:tr>
       <w:tr>
+        <w:trPr>
+          <w:cantSplit/>
+        </w:trPr>
         <w:tc>
           <w:tcPr>
             <w:tcW w:type="dxa" w:w="2088"/>
             <w:vAlign w:val="center"/>
           </w:tcPr>
           <w:p>
-            <w:pPr>
-              <w:spacing w:after="20" w:before="20"/>
-            </w:pPr>
-            <w:r>
-              <w:rPr>
-                <w:sz w:val="15"/>
-              </w:rPr>
-              <w:t>Cross-browser/responsive</w:t>
+            <w:r>
+              <w:t>Admin CRUD</w:t>
             </w:r>
           </w:p>
         </w:tc>
@@ -6356,14 +6775,8 @@
             <w:vAlign w:val="center"/>
           </w:tcPr>
           <w:p>
-            <w:pPr>
-              <w:spacing w:after="20" w:before="20"/>
-            </w:pPr>
-            <w:r>
-              <w:rPr>
-                <w:sz w:val="15"/>
-              </w:rPr>
-              <w:t>Layout on target desktop/mobile browsers</w:t>
+            <w:r>
+              <w:t>Authorized user can manage movies/theatres/shows; standard user receives 403</w:t>
             </w:r>
           </w:p>
         </w:tc>
@@ -6373,14 +6786,113 @@
             <w:vAlign w:val="center"/>
           </w:tcPr>
           <w:p>
-            <w:pPr>
-              <w:spacing w:after="20" w:before="20"/>
-            </w:pPr>
-            <w:r>
-              <w:rPr>
-                <w:sz w:val="15"/>
-              </w:rPr>
-              <w:t>Not run live</w:t>
+            <w:r>
+              <w:t>Manual verification required after role setup</w:t>
+            </w:r>
+          </w:p>
+        </w:tc>
+      </w:tr>
+      <w:tr>
+        <w:trPr>
+          <w:cantSplit/>
+        </w:trPr>
+        <w:tc>
+          <w:tcPr>
+            <w:tcW w:type="dxa" w:w="3331"/>
+          </w:tcPr>
+          <w:p>
+            <w:r>
+              <w:t>Frontend/responsive</w:t>
+            </w:r>
+          </w:p>
+        </w:tc>
+        <w:tc>
+          <w:tcPr>
+            <w:tcW w:type="dxa" w:w="3331"/>
+          </w:tcPr>
+          <w:p>
+            <w:r>
+              <w:t>Filters, show modal, My Tickets, notifications, AdminPanel</w:t>
+            </w:r>
+          </w:p>
+        </w:tc>
+        <w:tc>
+          <w:tcPr>
+            <w:tcW w:type="dxa" w:w="3331"/>
+          </w:tcPr>
+          <w:p>
+            <w:r>
+              <w:t>Browser regression required after Vercel redeploy</w:t>
+            </w:r>
+          </w:p>
+        </w:tc>
+      </w:tr>
+      <w:tr>
+        <w:trPr>
+          <w:cantSplit/>
+        </w:trPr>
+        <w:tc>
+          <w:tcPr>
+            <w:tcW w:type="dxa" w:w="3331"/>
+          </w:tcPr>
+          <w:p>
+            <w:r>
+              <w:t>Payments</w:t>
+            </w:r>
+          </w:p>
+        </w:tc>
+        <w:tc>
+          <w:tcPr>
+            <w:tcW w:type="dxa" w:w="3331"/>
+          </w:tcPr>
+          <w:p>
+            <w:r>
+              <w:t>Demo payment entry exists and no real charge is made</w:t>
+            </w:r>
+          </w:p>
+        </w:tc>
+        <w:tc>
+          <w:tcPr>
+            <w:tcW w:type="dxa" w:w="3331"/>
+          </w:tcPr>
+          <w:p>
+            <w:r>
+              <w:t>Expected simulation design; verify in UI</w:t>
+            </w:r>
+          </w:p>
+        </w:tc>
+      </w:tr>
+      <w:tr>
+        <w:trPr>
+          <w:cantSplit/>
+        </w:trPr>
+        <w:tc>
+          <w:tcPr>
+            <w:tcW w:type="dxa" w:w="3331"/>
+          </w:tcPr>
+          <w:p>
+            <w:r>
+              <w:t>Evidence</w:t>
+            </w:r>
+          </w:p>
+        </w:tc>
+        <w:tc>
+          <w:tcPr>
+            <w:tcW w:type="dxa" w:w="3331"/>
+          </w:tcPr>
+          <w:p>
+            <w:r>
+              <w:t>Screenshots and final demo URL</w:t>
+            </w:r>
+          </w:p>
+        </w:tc>
+        <w:tc>
+          <w:tcPr>
+            <w:tcW w:type="dxa" w:w="3331"/>
+          </w:tcPr>
+          <w:p>
+            <w:r>
+              <w:t>Add actual evidence after tests</w:t>
             </w:r>
           </w:p>
         </w:tc>
@@ -6401,10 +6913,7 @@
     </w:p>
     <w:p>
       <w:r>
-        <w:rPr>
-          <w:i w:val="0"/>
-        </w:rPr>
-        <w:t>Before final submission, capture screenshots directly from the running app and save them in `assets/screenshots/`. Suggested screenshots: (1) home/catalogue; (2) search or genre filter; (3) register/login; (4) seat-selection modal; (5) My Tickets showing a real local demo booking; (6) API health response. The design previews in this report should be replaced with real output screenshots before treating the report as final evidence.</w:t>
+        <w:t>After the expanded code is deployed and tested, capture genuine screenshots in `assets/screenshots/`: (1) home/catalogue; (2) title/genre/language/city filters; (3) selected show and theatre; (4) live seat map; (5) booking confirmation and My Tickets; (6) cancellation/released seats; (7) notifications; (8) admin dashboard and show management; and (9) public health response. Images in `assets/previews/` remain illustrative, not runtime evidence.</w:t>
       </w:r>
     </w:p>
     <w:p>
@@ -6417,10 +6926,7 @@
     </w:p>
     <w:p>
       <w:r>
-        <w:rPr>
-          <w:i w:val="0"/>
-        </w:rPr>
-        <w:t>Use the timed steps in `docs/DEMO_SCRIPT.md`. Record the actual website after successful test execution, upload to a course-approved share location, test that the link opens for a reviewer, and paste the real URL into the submission worksheet. No demo video has been fabricated or uploaded as part of this package.</w:t>
+        <w:t>Use `docs/DEMO_SCRIPT.md` after the final regression checklist passes. Record the actual deployed website, upload the video to a course-approved share location, test that the link opens for a reviewer, and paste the real video URL into the submission worksheet. No demo video is fabricated or included in this package.</w:t>
       </w:r>
     </w:p>
     <w:p>
@@ -6445,7 +6951,7 @@
         <w:spacing w:after="40"/>
       </w:pPr>
       <w:r>
-        <w:t>No online payment provider or refund flow.</w:t>
+        <w:t>No live payment-provider integration: the system records a clearly labelled simulated payment and no money is charged.</w:t>
       </w:r>
     </w:p>
     <w:p>
@@ -6454,7 +6960,7 @@
         <w:spacing w:after="40"/>
       </w:pPr>
       <w:r>
-        <w:t>No admin UI for creating/updating/removing movies or showtimes.</w:t>
+        <w:t>The admin interface exists, but an authorized account must be deliberately promoted to the `admin` role by the trusted project owner for the classroom demo.</w:t>
       </w:r>
     </w:p>
     <w:p>
@@ -6463,7 +6969,7 @@
         <w:spacing w:after="40"/>
       </w:pPr>
       <w:r>
-        <w:t>Seat availability check can race under simultaneous requests and is not safe as a real inventory reservation system.</w:t>
+        <w:t>The unique show-seat index prevents duplicate seat claims, but the entire booking/payment/notification workflow is not a single multi-document transaction and seat locks do not have expiry windows.</w:t>
       </w:r>
     </w:p>
     <w:p>
@@ -6472,7 +6978,7 @@
         <w:spacing w:after="40"/>
       </w:pPr>
       <w:r>
-        <w:t>The seat map includes fixed preview-occupied positions; only persisted backend bookings are authoritative during submission.</w:t>
+        <w:t>Email/SMS ticket delivery, downloadable PDF/QR tickets and an external cinema inventory integration are not included.</w:t>
       </w:r>
     </w:p>
     <w:p>
@@ -6481,7 +6987,7 @@
         <w:spacing w:after="40"/>
       </w:pPr>
       <w:r>
-        <w:t>Basic validation is implemented, but production hardening (rate limiting, deeper validation, transaction strategy, secure deployment config and monitoring) remains.</w:t>
+        <w:t>Rate limiting uses an in-process store and is not distributed across multiple server instances; production deployment requires more operational hardening, audit trails, monitoring and a reviewed secret-rotation process.</w:t>
       </w:r>
     </w:p>
     <w:p>
@@ -6490,7 +6996,7 @@
         <w:spacing w:after="40"/>
       </w:pPr>
       <w:r>
-        <w:t>Poster URLs depend on external hosts and can change.</w:t>
+        <w:t>Poster URLs depend on external image hosts and may expire or be blocked.</w:t>
       </w:r>
     </w:p>
     <w:p>
@@ -6499,7 +7005,7 @@
         <w:spacing w:after="40"/>
       </w:pPr>
       <w:r>
-        <w:t>Live integration and browser testing still need to be performed on the submitter’s computer.</w:t>
+        <w:t>The expanded source must be committed to GitHub and the latest Render/Vercel deployments must be verified before the final video is recorded. Full live tests are still required for the expanded release.</w:t>
       </w:r>
     </w:p>
     <w:p>
@@ -6516,7 +7022,7 @@
         <w:spacing w:after="40"/>
       </w:pPr>
       <w:r>
-        <w:t>Admin dashboard for movies, theatre screens, shows and pricing.</w:t>
+        <w:t>Connect a real payment provider in test mode with signed webhook verification before considering any real payment use.</w:t>
       </w:r>
     </w:p>
     <w:p>
@@ -6525,7 +7031,7 @@
         <w:spacing w:after="40"/>
       </w:pPr>
       <w:r>
-        <w:t>Transactional or atomic seat reservation with expiry/locking.</w:t>
+        <w:t>Add a multi-document transaction/reconciliation strategy and expiring reservations/cleanup for abandoned checkouts.</w:t>
       </w:r>
     </w:p>
     <w:p>
@@ -6534,7 +7040,7 @@
         <w:spacing w:after="40"/>
       </w:pPr>
       <w:r>
-        <w:t>Payment gateway integration and verified payment callbacks.</w:t>
+        <w:t>Add email/QR ticket delivery, user-facing ticket download and verified refund integration.</w:t>
       </w:r>
     </w:p>
     <w:p>
@@ -6543,7 +7049,7 @@
         <w:spacing w:after="40"/>
       </w:pPr>
       <w:r>
-        <w:t>Email ticket delivery and downloadable ticket PDF/QR code.</w:t>
+        <w:t>Add administrator audit logs and a safer privileged account provisioning workflow.</w:t>
       </w:r>
     </w:p>
     <w:p>
@@ -6552,7 +7058,7 @@
         <w:spacing w:after="40"/>
       </w:pPr>
       <w:r>
-        <w:t>Pagination, loading states, stronger form validation and accessibility audit.</w:t>
+        <w:t>Add full API integration, browser end-to-end, load and accessibility tests plus CI.</w:t>
       </w:r>
     </w:p>
     <w:p>
@@ -6561,7 +7067,7 @@
         <w:spacing w:after="40"/>
       </w:pPr>
       <w:r>
-        <w:t>Automated unit/API/UI tests and CI pipeline.</w:t>
+        <w:t>Replace in-memory rate-limit storage if horizontally scaling; add centralized logging and monitoring.</w:t>
       </w:r>
     </w:p>
     <w:p>
@@ -6570,7 +7076,7 @@
         <w:spacing w:after="40"/>
       </w:pPr>
       <w:r>
-        <w:t>Deploy frontend, API and MongoDB with production environment variables and monitoring.</w:t>
+        <w:t>Harden deployment configuration, narrow database network access and run regular dependency/security reviews.</w:t>
       </w:r>
     </w:p>
     <w:p>
@@ -6583,10 +7089,7 @@
     </w:p>
     <w:p>
       <w:r>
-        <w:rPr>
-          <w:i w:val="0"/>
-        </w:rPr>
-        <w:t>IMovies demonstrates the main building blocks of a MERN full-stack application: a React interface, Express REST API, Mongoose data models, MongoDB persistence, JWT authentication and a multi-step booking flow. This package includes the source project, setup documentation, architectural diagrams, test plan, demo outline and an editable report plus PDF. Completion of the actual submission still requires running the application against MongoDB, recording the test results, capturing real runtime screenshots, publishing the repository, recording/uploading the demo video and submitting the real links through SkillWallet.</w:t>
+        <w:t>The expanded IMovies source demonstrates a fuller MERN cinema workflow: movie discovery, theatre/show schedules, JWT authentication, show-specific seat reservations, realtime seat updates, cancellation, notifications, demo-payment records and role-protected administration. Five helper unit tests and static syntax checks passed during packaging. The upgraded source must be committed and deployed, the manual regression checklist completed, and genuine output screenshots captured before the final demo video and SkillWallet submission. Payments remain simulation-only.</w:t>
       </w:r>
     </w:p>
     <w:p>
@@ -6707,6 +7210,38 @@
     </w:p>
     <w:p>
       <w:pPr>
+        <w:pStyle w:val="ListBullet"/>
+      </w:pPr>
+      <w:r>
+        <w:t>Socket.IO. “Socket.IO documentation.” https://socket.io/docs/v4/</w:t>
+      </w:r>
+    </w:p>
+    <w:p>
+      <w:pPr>
+        <w:pStyle w:val="ListBullet"/>
+      </w:pPr>
+      <w:r>
+        <w:t>Express Rate Limit. “Documentation.” https://express-rate-limit.mintlify.app/overview</w:t>
+      </w:r>
+    </w:p>
+    <w:p>
+      <w:pPr>
+        <w:pStyle w:val="ListBullet"/>
+      </w:pPr>
+      <w:r>
+        <w:t>Render. “Documentation.” https://render.com/docs</w:t>
+      </w:r>
+    </w:p>
+    <w:p>
+      <w:pPr>
+        <w:pStyle w:val="ListBullet"/>
+      </w:pPr>
+      <w:r>
+        <w:t>Vercel. “Documentation.” https://vercel.com/docs</w:t>
+      </w:r>
+    </w:p>
+    <w:p>
+      <w:pPr>
         <w:pStyle w:val="Heading1"/>
       </w:pPr>
       <w:r>
@@ -6715,10 +7250,7 @@
     </w:p>
     <w:p>
       <w:r>
-        <w:rPr>
-          <w:i w:val="0"/>
-        </w:rPr>
-        <w:t>Fill the following with real links after publishing. Do not submit the bracketed placeholder text as a URL.</w:t>
+        <w:t>Repository and live-site links below have been filled from the project owner’s current deployment. Add the real demo-video URL only after recording and verifying the final expanded release.</w:t>
       </w:r>
     </w:p>
     <w:tbl>
@@ -6733,6 +7265,10 @@
         <w:gridCol w:w="4997"/>
       </w:tblGrid>
       <w:tr>
+        <w:trPr>
+          <w:tblHeader w:val="true"/>
+          <w:cantSplit/>
+        </w:trPr>
         <w:tc>
           <w:tcPr>
             <w:tcW w:type="dxa" w:w="3312"/>
@@ -6744,7 +7280,6 @@
               <w:rPr>
                 <w:b/>
                 <w:color w:val="FFFFFF"/>
-                <w:sz w:val="16"/>
               </w:rPr>
               <w:t>Deliverable</w:t>
             </w:r>
@@ -6761,7 +7296,6 @@
               <w:rPr>
                 <w:b/>
                 <w:color w:val="FFFFFF"/>
-                <w:sz w:val="16"/>
               </w:rPr>
               <w:t>Link / location</w:t>
             </w:r>
@@ -6769,19 +7303,16 @@
         </w:tc>
       </w:tr>
       <w:tr>
+        <w:trPr>
+          <w:cantSplit/>
+        </w:trPr>
         <w:tc>
           <w:tcPr>
             <w:tcW w:type="dxa" w:w="3312"/>
             <w:vAlign w:val="center"/>
           </w:tcPr>
           <w:p>
-            <w:pPr>
-              <w:spacing w:after="20" w:before="20"/>
-            </w:pPr>
-            <w:r>
-              <w:rPr>
-                <w:sz w:val="16"/>
-              </w:rPr>
+            <w:r>
               <w:t>GitHub repository</w:t>
             </w:r>
           </w:p>
@@ -6792,19 +7323,16 @@
             <w:vAlign w:val="center"/>
           </w:tcPr>
           <w:p>
-            <w:pPr>
-              <w:spacing w:after="20" w:before="20"/>
-            </w:pPr>
-            <w:r>
-              <w:rPr>
-                <w:sz w:val="16"/>
-              </w:rPr>
-              <w:t>[PASTE REAL GITHUB REPOSITORY URL]</w:t>
+            <w:r>
+              <w:t>https://github.com/AmayGuptaEN24CS3010116/IMovies</w:t>
             </w:r>
           </w:p>
         </w:tc>
       </w:tr>
       <w:tr>
+        <w:trPr>
+          <w:cantSplit/>
+        </w:trPr>
         <w:tc>
           <w:tcPr>
             <w:tcW w:type="dxa" w:w="3312"/>
@@ -6812,14 +7340,8 @@
             <w:shd w:fill="F4F2F9"/>
           </w:tcPr>
           <w:p>
-            <w:pPr>
-              <w:spacing w:after="20" w:before="20"/>
-            </w:pPr>
-            <w:r>
-              <w:rPr>
-                <w:sz w:val="16"/>
-              </w:rPr>
-              <w:t>Demo video</w:t>
+            <w:r>
+              <w:t>Live website</w:t>
             </w:r>
           </w:p>
         </w:tc>
@@ -6830,33 +7352,24 @@
             <w:shd w:fill="F4F2F9"/>
           </w:tcPr>
           <w:p>
-            <w:pPr>
-              <w:spacing w:after="20" w:before="20"/>
-            </w:pPr>
-            <w:r>
-              <w:rPr>
-                <w:sz w:val="16"/>
-              </w:rPr>
-              <w:t>[PASTE REAL SHAREABLE VIDEO URL]</w:t>
+            <w:r>
+              <w:t>https://i-movies-amber.vercel.app/ (verify after expanded version redeploys)</w:t>
             </w:r>
           </w:p>
         </w:tc>
       </w:tr>
       <w:tr>
+        <w:trPr>
+          <w:cantSplit/>
+        </w:trPr>
         <w:tc>
           <w:tcPr>
             <w:tcW w:type="dxa" w:w="3312"/>
             <w:vAlign w:val="center"/>
           </w:tcPr>
           <w:p>
-            <w:pPr>
-              <w:spacing w:after="20" w:before="20"/>
-            </w:pPr>
-            <w:r>
-              <w:rPr>
-                <w:sz w:val="16"/>
-              </w:rPr>
-              <w:t>Code Drive link (if separately required)</w:t>
+            <w:r>
+              <w:t>Render health endpoint</w:t>
             </w:r>
           </w:p>
         </w:tc>
@@ -6866,19 +7379,16 @@
             <w:vAlign w:val="center"/>
           </w:tcPr>
           <w:p>
-            <w:pPr>
-              <w:spacing w:after="20" w:before="20"/>
-            </w:pPr>
-            <w:r>
-              <w:rPr>
-                <w:sz w:val="16"/>
-              </w:rPr>
-              <w:t>[PASTE REAL DRIVE URL OR MARK NOT REQUIRED]</w:t>
+            <w:r>
+              <w:t>https://imovies-api.onrender.com/api/health (verify after expanded version redeploys)</w:t>
             </w:r>
           </w:p>
         </w:tc>
       </w:tr>
       <w:tr>
+        <w:trPr>
+          <w:cantSplit/>
+        </w:trPr>
         <w:tc>
           <w:tcPr>
             <w:tcW w:type="dxa" w:w="3312"/>
@@ -6886,14 +7396,8 @@
             <w:shd w:fill="F4F2F9"/>
           </w:tcPr>
           <w:p>
-            <w:pPr>
-              <w:spacing w:after="20" w:before="20"/>
-            </w:pPr>
-            <w:r>
-              <w:rPr>
-                <w:sz w:val="16"/>
-              </w:rPr>
-              <w:t>Report</w:t>
+            <w:r>
+              <w:t>Demo video</w:t>
             </w:r>
           </w:p>
         </w:tc>
@@ -6904,33 +7408,24 @@
             <w:shd w:fill="F4F2F9"/>
           </w:tcPr>
           <w:p>
-            <w:pPr>
-              <w:spacing w:after="20" w:before="20"/>
-            </w:pPr>
-            <w:r>
-              <w:rPr>
-                <w:sz w:val="16"/>
-              </w:rPr>
-              <w:t>docs/IMovies-Project-Report.pdf and editable DOCX</w:t>
+            <w:r>
+              <w:t>Add actual shareable Google Drive/YouTube URL after recording final version.</w:t>
             </w:r>
           </w:p>
         </w:tc>
       </w:tr>
       <w:tr>
+        <w:trPr>
+          <w:cantSplit/>
+        </w:trPr>
         <w:tc>
           <w:tcPr>
             <w:tcW w:type="dxa" w:w="3312"/>
             <w:vAlign w:val="center"/>
           </w:tcPr>
           <w:p>
-            <w:pPr>
-              <w:spacing w:after="20" w:before="20"/>
-            </w:pPr>
-            <w:r>
-              <w:rPr>
-                <w:sz w:val="16"/>
-              </w:rPr>
-              <w:t>Source package</w:t>
+            <w:r>
+              <w:t>Code Drive link</w:t>
             </w:r>
           </w:p>
         </w:tc>
@@ -6940,19 +7435,16 @@
             <w:vAlign w:val="center"/>
           </w:tcPr>
           <w:p>
-            <w:pPr>
-              <w:spacing w:after="20" w:before="20"/>
-            </w:pPr>
-            <w:r>
-              <w:rPr>
-                <w:sz w:val="16"/>
-              </w:rPr>
-              <w:t>Client and server code at repository root</w:t>
+            <w:r>
+              <w:t>Only fill if SkillWallet separately requires it; do not invent a URL.</w:t>
             </w:r>
           </w:p>
         </w:tc>
       </w:tr>
       <w:tr>
+        <w:trPr>
+          <w:cantSplit/>
+        </w:trPr>
         <w:tc>
           <w:tcPr>
             <w:tcW w:type="dxa" w:w="3312"/>
@@ -6960,14 +7452,8 @@
             <w:shd w:fill="F4F2F9"/>
           </w:tcPr>
           <w:p>
-            <w:pPr>
-              <w:spacing w:after="20" w:before="20"/>
-            </w:pPr>
-            <w:r>
-              <w:rPr>
-                <w:sz w:val="16"/>
-              </w:rPr>
-              <w:t>Test evidence</w:t>
+            <w:r>
+              <w:t>Report</w:t>
             </w:r>
           </w:p>
         </w:tc>
@@ -6978,14 +7464,83 @@
             <w:shd w:fill="F4F2F9"/>
           </w:tcPr>
           <w:p>
-            <w:pPr>
-              <w:spacing w:after="20" w:before="20"/>
-            </w:pPr>
-            <w:r>
-              <w:rPr>
-                <w:sz w:val="16"/>
-              </w:rPr>
-              <w:t>assets/screenshots/ after live local testing</w:t>
+            <w:r>
+              <w:t>docs/IMovies-Project-Report.pdf and editable DOCX</w:t>
+            </w:r>
+          </w:p>
+        </w:tc>
+      </w:tr>
+      <w:tr>
+        <w:trPr>
+          <w:cantSplit/>
+        </w:trPr>
+        <w:tc>
+          <w:tcPr>
+            <w:tcW w:type="dxa" w:w="4997"/>
+          </w:tcPr>
+          <w:p>
+            <w:r>
+              <w:t>Source/dataset</w:t>
+            </w:r>
+          </w:p>
+        </w:tc>
+        <w:tc>
+          <w:tcPr>
+            <w:tcW w:type="dxa" w:w="4997"/>
+          </w:tcPr>
+          <w:p>
+            <w:r>
+              <w:t>client/, server/, server/data/movies.json</w:t>
+            </w:r>
+          </w:p>
+        </w:tc>
+      </w:tr>
+      <w:tr>
+        <w:trPr>
+          <w:cantSplit/>
+        </w:trPr>
+        <w:tc>
+          <w:tcPr>
+            <w:tcW w:type="dxa" w:w="4997"/>
+          </w:tcPr>
+          <w:p>
+            <w:r>
+              <w:t>Architecture diagrams</w:t>
+            </w:r>
+          </w:p>
+        </w:tc>
+        <w:tc>
+          <w:tcPr>
+            <w:tcW w:type="dxa" w:w="4997"/>
+          </w:tcPr>
+          <w:p>
+            <w:r>
+              <w:t>assets/diagrams/</w:t>
+            </w:r>
+          </w:p>
+        </w:tc>
+      </w:tr>
+      <w:tr>
+        <w:trPr>
+          <w:cantSplit/>
+        </w:trPr>
+        <w:tc>
+          <w:tcPr>
+            <w:tcW w:type="dxa" w:w="4997"/>
+          </w:tcPr>
+          <w:p>
+            <w:r>
+              <w:t>Runtime evidence</w:t>
+            </w:r>
+          </w:p>
+        </w:tc>
+        <w:tc>
+          <w:tcPr>
+            <w:tcW w:type="dxa" w:w="4997"/>
+          </w:tcPr>
+          <w:p>
+            <w:r>
+              <w:t>assets/screenshots/ - populate with authentic screenshots</w:t>
             </w:r>
           </w:p>
         </w:tc>

</xml_diff>